<commit_message>
Fix GitHub markdown rendering issues: repair escaped LaTeX, multiline display math, and table formatting
</commit_message>
<xml_diff>
--- a/FINAL_COMPREHENSIVE_PROJECT_REPORT.docx
+++ b/FINAL_COMPREHENSIVE_PROJECT_REPORT.docx
@@ -12,7 +12,7 @@
           <w:color w:val="475569"/>
           <w:sz w:val="36"/>
         </w:rPr>
-        <w:t xml:space="preserve"> Direct \text{CO}2-to-Dimethyl Ether (DME) Catalytic Membrane Reactor: Comprehensive Technical Project Report</w:t>
+        <w:t xml:space="preserve"> Direct CO2-to-Dimethyl Ether (DME) Catalytic Membrane Reactor: Comprehensive Technical Project Report</w:t>
       </w:r>
     </w:p>
     <w:p>
@@ -24,7 +24,7 @@
           <w:color w:val="1F2937"/>
           <w:sz w:val="20"/>
         </w:rPr>
-        <w:t>**Document Title:** Physical Modeling, Geometric Intensification, Machine Learning Optimization, and Continuum CFD Simulation of Catalytic Membrane Reactors for Direct \text{CO}_2 Hydrogenation to Dimethyl Ether</w:t>
+        <w:t>**Document Title:** Physical Modeling, Geometric Intensification, Machine Learning Optimization, and Continuum CFD Simulation of Catalytic Membrane Reactors for Direct CO2 Hydrogenation to Dimethyl Ether</w:t>
       </w:r>
     </w:p>
     <w:p>
@@ -48,7 +48,7 @@
           <w:color w:val="1F2937"/>
           <w:sz w:val="20"/>
         </w:rPr>
-        <w:t>**Repository Source:** [`p1`](file:///Users/sameershekhar/Documents/GitHub/p1) &amp; [`paper1`](file:///Users/sameershekhar/Documents/GitHub/LLM-/paper1%20)</w:t>
+        <w:t>**Repository Source:** [`p1`](file:///Users/sameershekhar/Documents/GitHub/p1) &amp; [`paper1`](file:///Users/sameershekhar/Documents/GitHub/LLM-/paper1)</w:t>
       </w:r>
     </w:p>
     <w:p>
@@ -163,7 +163,7 @@
           <w:color w:val="1F2937"/>
           <w:sz w:val="20"/>
         </w:rPr>
-        <w:t>[Comprehensive Engineering Assumptions Register](#6-comprehensive-engineering-assumptions-register)</w:t>
+        <w:t>[Chemical Engineering Logic &amp; Mechanistic Justifications](#6-chemical-engineering-logic--mechanistic-justifications)</w:t>
       </w:r>
     </w:p>
     <w:p>
@@ -176,7 +176,7 @@
           <w:color w:val="1F2937"/>
           <w:sz w:val="20"/>
         </w:rPr>
-        <w:t>[Dimensionless Quantities &amp; Transport Criteria](#7-dimensionless-quantities--transport-criteria)</w:t>
+        <w:t>[Comprehensive Engineering Assumptions Register](#7-comprehensive-engineering-assumptions-register)</w:t>
       </w:r>
     </w:p>
     <w:p>
@@ -189,7 +189,7 @@
           <w:color w:val="1F2937"/>
           <w:sz w:val="20"/>
         </w:rPr>
-        <w:t>[Reactor Topologies &amp; Invariant Geometric Baseline](#8-reactor-topologies--invariant-geometric-baseline)</w:t>
+        <w:t>[Dimensionless Quantities &amp; Transport Criteria](#8-dimensionless-quantities--transport-criteria)</w:t>
       </w:r>
     </w:p>
     <w:p>
@@ -202,7 +202,7 @@
           <w:color w:val="1F2937"/>
           <w:sz w:val="20"/>
         </w:rPr>
-        <w:t>[Detailed Dimension &amp; Spatial Clearance Comparison](#9-detailed-dimension--spatial-clearance-comparison)</w:t>
+        <w:t>[Reactor Topologies &amp; Invariant Geometric Baseline](#9-reactor-topologies--invariant-geometric-baseline)</w:t>
       </w:r>
     </w:p>
     <w:p>
@@ -215,7 +215,7 @@
           <w:color w:val="1F2937"/>
           <w:sz w:val="20"/>
         </w:rPr>
-        <w:t>[Operating Conditions, Flow Rates &amp; Sweep Mechanics](#10-operating-conditions-flow-rates--sweep-mechanics)</w:t>
+        <w:t>[Detailed Dimension &amp; Spatial Clearance Comparison](#10-detailed-dimension--spatial-clearance-comparison)</w:t>
       </w:r>
     </w:p>
     <w:p>
@@ -228,7 +228,7 @@
           <w:color w:val="1F2937"/>
           <w:sz w:val="20"/>
         </w:rPr>
-        <w:t>[Multi-Architecture Simulation Benchmark (Lu Kinetics)](#11-multi-architecture-simulation-benchmark-lu-kinetics)</w:t>
+        <w:t>[Operating Conditions, Flow Rates &amp; Sweep Mechanics](#11-operating-conditions-flow-rates--sweep-mechanics)</w:t>
       </w:r>
     </w:p>
     <w:p>
@@ -241,7 +241,7 @@
           <w:color w:val="1F2937"/>
           <w:sz w:val="20"/>
         </w:rPr>
-        <w:t>[Process Intensification Factors &amp; Transport Timescales](#12-process-intensification-factors--transport-timescales)</w:t>
+        <w:t>[Multi-Architecture Simulation Benchmark (Lu Kinetics)](#12-multi-architecture-simulation-benchmark-lu-kinetics)</w:t>
       </w:r>
     </w:p>
     <w:p>
@@ -254,7 +254,7 @@
           <w:color w:val="1F2937"/>
           <w:sz w:val="20"/>
         </w:rPr>
-        <w:t>[Deconstruction of the "8 Percent Water" Literature Myth](#13-deconstruction-of-the-8-percent-water-literature-myth)</w:t>
+        <w:t>[Process Intensification Factors &amp; Transport Timescales](#13-process-intensification-factors--transport-timescales)</w:t>
       </w:r>
     </w:p>
     <w:p>
@@ -267,7 +267,7 @@
           <w:color w:val="1F2937"/>
           <w:sz w:val="20"/>
         </w:rPr>
-        <w:t>[Machine Learning Surrogate Modeling &amp; Sensitivity Analysis](#14-machine-learning-surrogate-modeling--sensitivity-analysis)</w:t>
+        <w:t>[Deconstruction of the "8 Percent Water" Literature Myth](#14-deconstruction-of-the-8-percent-water-literature-myth)</w:t>
       </w:r>
     </w:p>
     <w:p>
@@ -280,7 +280,7 @@
           <w:color w:val="1F2937"/>
           <w:sz w:val="20"/>
         </w:rPr>
-        <w:t>[ANSYS Fluent Continuum CFD Replication Manual](#15-ansys-fluent-continuum-cfd-replication-manual)</w:t>
+        <w:t>[Machine Learning Surrogate Modeling &amp; Sensitivity Analysis](#15-machine-learning-surrogate-modeling--sensitivity-analysis)</w:t>
       </w:r>
     </w:p>
     <w:p>
@@ -293,7 +293,20 @@
           <w:color w:val="1F2937"/>
           <w:sz w:val="20"/>
         </w:rPr>
-        <w:t>[Project Repository File Index](#16-project-repository-file-index)</w:t>
+        <w:t>[ANSYS Fluent Continuum CFD Replication Manual](#16-ansys-fluent-continuum-cfd-replication-manual)</w:t>
+      </w:r>
+    </w:p>
+    <w:p>
+      <w:pPr>
+        <w:pStyle w:val="ListNumber"/>
+        <w:spacing w:before="20" w:after="40"/>
+      </w:pPr>
+      <w:r>
+        <w:rPr>
+          <w:color w:val="1F2937"/>
+          <w:sz w:val="20"/>
+        </w:rPr>
+        <w:t>[Project Repository File Index](#17-project-repository-file-index)</w:t>
       </w:r>
     </w:p>
     <w:p>
@@ -331,7 +344,7 @@
           <w:color w:val="1F2937"/>
           <w:sz w:val="20"/>
         </w:rPr>
-        <w:t>The catalytic hydrogenation of captured carbon dioxide (\text{CO}_2) utilizing green hydrogen (\text{H}_2) generated via renewable water electrolysis represents a closed-loop carbon capture and utilization (CCU) framework. Among synthetic e-fuels, **dimethyl ether (\text{CH}_3\text{OCH}_3, DME)** is an ultra-clean alternative fuel with a high cetane number (55\text{--}60), low particulate soot emissions, and physical properties identical to liquified petroleum gas (LPG, condensing at 0.5\text{ MPa} at ambient temperature).</w:t>
+        <w:t>The catalytic hydrogenation of captured carbon dioxide (\text{CO}_2) utilizing green hydrogen (\text{H}_2) generated via renewable water electrolysis represents a closed-loop carbon capture and utilization (CCU) framework. Among synthetic e-fuels, **dimethyl ether (\text{CH}_3\text{OCH}_3, DME)** is an ultra-clean alternative fuel with a high cetane number (55\text{ to }60), low particulate soot emissions, and physical properties identical to liquified petroleum gas (LPG, condensing at 0.5\text{ MPa} at ambient temperature).</w:t>
       </w:r>
     </w:p>
     <w:p>
@@ -370,7 +383,7 @@
           <w:color w:val="1F2937"/>
           <w:sz w:val="20"/>
         </w:rPr>
-        <w:t>Methanol synthesis over \text{Cu/ZnO/Al}_2\text{O}_3 (50\text{--}100\text{ bar}, 220\text{--}280^\circ\text{C}).</w:t>
+        <w:t>Methanol synthesis over \text{Cu/ZnO/Al}_2\text{O}_3 (50\text{ to }100\text{ bar}, 220\text{ to }280^\circ\text{C}).</w:t>
       </w:r>
     </w:p>
     <w:p>
@@ -383,7 +396,7 @@
           <w:color w:val="1F2937"/>
           <w:sz w:val="20"/>
         </w:rPr>
-        <w:t>Intermediate condensation, depressurization, multi-column distillation to remove water, reheating, and gas-phase dehydration over solid acid catalysts (\gamma\text{-Al}_2\text{O}_3 or \text{H-ZSM-5}) at 250\text{--}350^\circ\text{C} (2\text{CH}_3\text{OH} \to \text{DME} + \text{H}_2\text{O}).</w:t>
+        <w:t>Intermediate condensation, depressurization, multi-column distillation to remove water, reheating, and gas-phase dehydration over solid acid catalysts (\gamma\text{-Al}_2\text{O}_3 or \text{H-ZSM-5}) at 250\text{ to }350^\circ\text{C} (2\text{CH}_3\text{OH} \to \text{DME} + \text{H}_2\text{O}).</w:t>
       </w:r>
     </w:p>
     <w:p>
@@ -471,21 +484,41 @@
           <w:color w:val="475569"/>
           <w:sz w:val="24"/>
         </w:rPr>
-        <w:t xml:space="preserve"> Reaction 1: \text{CO}2 Hydrogenation to Methanol</w:t>
+        <w:t xml:space="preserve"> Reaction 1: CO2 Hydrogenation to Methanol</w:t>
       </w:r>
     </w:p>
     <w:p>
       <w:pPr>
-        <w:spacing w:before="80" w:after="80"/>
-        <w:jc w:val="center"/>
+        <w:spacing w:before="40" w:after="80"/>
       </w:pPr>
       <w:r>
         <w:rPr>
-          <w:i/>
-          <w:color w:val="475569"/>
+          <w:color w:val="1F2937"/>
+          <w:sz w:val="20"/>
+        </w:rPr>
+      </w:r>
+    </w:p>
+    <w:p>
+      <w:pPr>
+        <w:spacing w:before="40" w:after="80"/>
+      </w:pPr>
+      <w:r>
+        <w:rPr>
+          <w:color w:val="1F2937"/>
           <w:sz w:val="20"/>
         </w:rPr>
         <w:t>\text{CO}_2 + 3\text{H}_2 \rightleftharpoons \text{CH}_3\text{OH} + \text{H}_2\text{O}, \quad \Delta H^\circ_{298\text{ K}} = -49.5\text{ kJ/mol}</w:t>
+      </w:r>
+    </w:p>
+    <w:p>
+      <w:pPr>
+        <w:spacing w:before="40" w:after="80"/>
+      </w:pPr>
+      <w:r>
+        <w:rPr>
+          <w:color w:val="1F2937"/>
+          <w:sz w:val="20"/>
+        </w:rPr>
       </w:r>
     </w:p>
     <w:p>
@@ -529,16 +562,36 @@
     </w:p>
     <w:p>
       <w:pPr>
-        <w:spacing w:before="80" w:after="80"/>
-        <w:jc w:val="center"/>
+        <w:spacing w:before="40" w:after="80"/>
       </w:pPr>
       <w:r>
         <w:rPr>
-          <w:i/>
-          <w:color w:val="475569"/>
+          <w:color w:val="1F2937"/>
+          <w:sz w:val="20"/>
+        </w:rPr>
+      </w:r>
+    </w:p>
+    <w:p>
+      <w:pPr>
+        <w:spacing w:before="40" w:after="80"/>
+      </w:pPr>
+      <w:r>
+        <w:rPr>
+          <w:color w:val="1F2937"/>
           <w:sz w:val="20"/>
         </w:rPr>
         <w:t>\text{CO}_2 + \text{H}_2 \rightleftharpoons \text{CO} + \text{H}_2\text{O}, \quad \Delta H^\circ_{298\text{ K}} = +41.2\text{ kJ/mol}</w:t>
+      </w:r>
+    </w:p>
+    <w:p>
+      <w:pPr>
+        <w:spacing w:before="40" w:after="80"/>
+      </w:pPr>
+      <w:r>
+        <w:rPr>
+          <w:color w:val="1F2937"/>
+          <w:sz w:val="20"/>
+        </w:rPr>
       </w:r>
     </w:p>
     <w:p>
@@ -582,16 +635,36 @@
     </w:p>
     <w:p>
       <w:pPr>
-        <w:spacing w:before="80" w:after="80"/>
-        <w:jc w:val="center"/>
+        <w:spacing w:before="40" w:after="80"/>
       </w:pPr>
       <w:r>
         <w:rPr>
-          <w:i/>
-          <w:color w:val="475569"/>
+          <w:color w:val="1F2937"/>
+          <w:sz w:val="20"/>
+        </w:rPr>
+      </w:r>
+    </w:p>
+    <w:p>
+      <w:pPr>
+        <w:spacing w:before="40" w:after="80"/>
+      </w:pPr>
+      <w:r>
+        <w:rPr>
+          <w:color w:val="1F2937"/>
           <w:sz w:val="20"/>
         </w:rPr>
         <w:t>2\text{CH}_3\text{OH} \rightleftharpoons \text{CH}_3\text{OCH}_3\text{ (DME)} + \text{H}_2\text{O}, \quad \Delta H^\circ_{298\text{ K}} = -23.6\text{ kJ/mol}</w:t>
+      </w:r>
+    </w:p>
+    <w:p>
+      <w:pPr>
+        <w:spacing w:before="40" w:after="80"/>
+      </w:pPr>
+      <w:r>
+        <w:rPr>
+          <w:color w:val="1F2937"/>
+          <w:sz w:val="20"/>
+        </w:rPr>
       </w:r>
     </w:p>
     <w:p>
@@ -635,16 +708,36 @@
     </w:p>
     <w:p>
       <w:pPr>
-        <w:spacing w:before="80" w:after="80"/>
-        <w:jc w:val="center"/>
+        <w:spacing w:before="40" w:after="80"/>
       </w:pPr>
       <w:r>
         <w:rPr>
-          <w:i/>
-          <w:color w:val="475569"/>
+          <w:color w:val="1F2937"/>
+          <w:sz w:val="20"/>
+        </w:rPr>
+      </w:r>
+    </w:p>
+    <w:p>
+      <w:pPr>
+        <w:spacing w:before="40" w:after="80"/>
+      </w:pPr>
+      <w:r>
+        <w:rPr>
+          <w:color w:val="1F2937"/>
           <w:sz w:val="20"/>
         </w:rPr>
         <w:t>2\text{CO}_2 + 6\text{H}_2 \rightleftharpoons \text{CH}_3\text{OCH}_3 + 3\text{H}_2\text{O}, \quad \Delta H^\circ_{298\text{ K}} = -122.6\text{ kJ/mol}</w:t>
+      </w:r>
+    </w:p>
+    <w:p>
+      <w:pPr>
+        <w:spacing w:before="40" w:after="80"/>
+      </w:pPr>
+      <w:r>
+        <w:rPr>
+          <w:color w:val="1F2937"/>
+          <w:sz w:val="20"/>
+        </w:rPr>
       </w:r>
     </w:p>
     <w:p>
@@ -695,18 +788,27 @@
           <w:color w:val="475569"/>
           <w:sz w:val="24"/>
         </w:rPr>
-        <w:t xml:space="preserve"> 3.1 Methanol Synthesis (K{eq1}): Graaf et al. (1986)</w:t>
+        <w:t xml:space="preserve"> 3.1 Methanol Synthesis (Keq1): Graaf et al. (1986)</w:t>
       </w:r>
     </w:p>
     <w:p>
       <w:pPr>
-        <w:spacing w:before="80" w:after="80"/>
-        <w:jc w:val="center"/>
+        <w:spacing w:before="40" w:after="80"/>
       </w:pPr>
       <w:r>
         <w:rPr>
-          <w:i/>
-          <w:color w:val="475569"/>
+          <w:color w:val="1F2937"/>
+          <w:sz w:val="20"/>
+        </w:rPr>
+      </w:r>
+    </w:p>
+    <w:p>
+      <w:pPr>
+        <w:spacing w:before="40" w:after="80"/>
+      </w:pPr>
+      <w:r>
+        <w:rPr>
+          <w:color w:val="1F2937"/>
           <w:sz w:val="20"/>
         </w:rPr>
         <w:t>\log_{10} K_{eq1} = \frac{3066}{T} - 10.592 \implies K_{eq1} = 10^{\left(\frac{3066}{T} - 10.592\right)} \quad [\text{bar}^{-2}]</w:t>
@@ -714,29 +816,26 @@
     </w:p>
     <w:p>
       <w:pPr>
-        <w:pStyle w:val="ListBullet"/>
-        <w:spacing w:before="20" w:after="40"/>
+        <w:spacing w:before="40" w:after="80"/>
       </w:pPr>
       <w:r>
         <w:rPr>
           <w:color w:val="1F2937"/>
           <w:sz w:val="20"/>
         </w:rPr>
-        <w:t>**At T = 523.15\text{ K} (250.0^\circ\text{C}):**</w:t>
       </w:r>
     </w:p>
     <w:p>
       <w:pPr>
-        <w:spacing w:before="80" w:after="80"/>
-        <w:jc w:val="center"/>
+        <w:pStyle w:val="ListBullet"/>
+        <w:spacing w:before="20" w:after="40"/>
       </w:pPr>
       <w:r>
         <w:rPr>
-          <w:i/>
-          <w:color w:val="475569"/>
+          <w:color w:val="1F2937"/>
           <w:sz w:val="20"/>
         </w:rPr>
-        <w:t>\log_{10} K_{eq1} = -4.7313 \implies \mathbf{K_{eq1} = 1.8563 \times 10^{-5}\text{ bar}^{-2}}</w:t>
+        <w:t>**At T = 523.15\text{ K} (250.0^\circ\text{C}):** \log_{10} K_{eq1} = -4.7313 \implies K_{eq1} = 1.8563 \times 10^{-5}\text{ bar}^{-2}</w:t>
       </w:r>
     </w:p>
     <w:p>
@@ -749,18 +848,27 @@
           <w:color w:val="475569"/>
           <w:sz w:val="24"/>
         </w:rPr>
-        <w:t xml:space="preserve"> 3.2 Reverse Water-Gas Shift (K{eq2}): Graaf et al. (1986)</w:t>
+        <w:t xml:space="preserve"> 3.2 Reverse Water-Gas Shift (Keq2): Graaf et al. (1986)</w:t>
       </w:r>
     </w:p>
     <w:p>
       <w:pPr>
-        <w:spacing w:before="80" w:after="80"/>
-        <w:jc w:val="center"/>
+        <w:spacing w:before="40" w:after="80"/>
       </w:pPr>
       <w:r>
         <w:rPr>
-          <w:i/>
-          <w:color w:val="475569"/>
+          <w:color w:val="1F2937"/>
+          <w:sz w:val="20"/>
+        </w:rPr>
+      </w:r>
+    </w:p>
+    <w:p>
+      <w:pPr>
+        <w:spacing w:before="40" w:after="80"/>
+      </w:pPr>
+      <w:r>
+        <w:rPr>
+          <w:color w:val="1F2937"/>
           <w:sz w:val="20"/>
         </w:rPr>
         <w:t>\log_{10} K_{eq2} = -\frac{2073}{T} + 2.029 \implies K_{eq2} = 10^{\left(-\frac{2073}{T} + 2.029\right)} \quad [-]</w:t>
@@ -768,29 +876,26 @@
     </w:p>
     <w:p>
       <w:pPr>
-        <w:pStyle w:val="ListBullet"/>
-        <w:spacing w:before="20" w:after="40"/>
+        <w:spacing w:before="40" w:after="80"/>
       </w:pPr>
       <w:r>
         <w:rPr>
           <w:color w:val="1F2937"/>
           <w:sz w:val="20"/>
         </w:rPr>
-        <w:t>**At T = 523.15\text{ K} (250.0^\circ\text{C}):**</w:t>
       </w:r>
     </w:p>
     <w:p>
       <w:pPr>
-        <w:spacing w:before="80" w:after="80"/>
-        <w:jc w:val="center"/>
+        <w:pStyle w:val="ListBullet"/>
+        <w:spacing w:before="20" w:after="40"/>
       </w:pPr>
       <w:r>
         <w:rPr>
-          <w:i/>
-          <w:color w:val="475569"/>
+          <w:color w:val="1F2937"/>
           <w:sz w:val="20"/>
         </w:rPr>
-        <w:t>\log_{10} K_{eq2} = -1.9335 \implies \mathbf{K_{eq2} = 0.011654}</w:t>
+        <w:t>**At T = 523.15\text{ K} (250.0^\circ\text{C}):** \log_{10} K_{eq2} = -1.9335 \implies K_{eq2} = 0.011654</w:t>
       </w:r>
     </w:p>
     <w:p>
@@ -803,18 +908,27 @@
           <w:color w:val="475569"/>
           <w:sz w:val="24"/>
         </w:rPr>
-        <w:t xml:space="preserve"> 3.3 Methanol Dehydration (K{p,3}): W. Lu et al. (2004) / Poto et al. (2021)</w:t>
+        <w:t xml:space="preserve"> 3.3 Methanol Dehydration (Kp3): W. Lu et al. (2004) / Poto et al. (2021)</w:t>
       </w:r>
     </w:p>
     <w:p>
       <w:pPr>
-        <w:spacing w:before="80" w:after="80"/>
-        <w:jc w:val="center"/>
+        <w:spacing w:before="40" w:after="80"/>
       </w:pPr>
       <w:r>
         <w:rPr>
-          <w:i/>
-          <w:color w:val="475569"/>
+          <w:color w:val="1F2937"/>
+          <w:sz w:val="20"/>
+        </w:rPr>
+      </w:r>
+    </w:p>
+    <w:p>
+      <w:pPr>
+        <w:spacing w:before="40" w:after="80"/>
+      </w:pPr>
+      <w:r>
+        <w:rPr>
+          <w:color w:val="1F2937"/>
           <w:sz w:val="20"/>
         </w:rPr>
         <w:t>\ln K_{p,3} = \frac{4019}{T} + 3.707 \ln T - 2.783 \times 10^{-3} T + 3.8 \times 10^{-7} T^2 - \frac{6.561 \times 10^4}{T^3} - 26.64 \quad [-]</w:t>
@@ -822,29 +936,26 @@
     </w:p>
     <w:p>
       <w:pPr>
-        <w:pStyle w:val="ListBullet"/>
-        <w:spacing w:before="20" w:after="40"/>
+        <w:spacing w:before="40" w:after="80"/>
       </w:pPr>
       <w:r>
         <w:rPr>
           <w:color w:val="1F2937"/>
           <w:sz w:val="20"/>
         </w:rPr>
-        <w:t>**At T = 523.15\text{ K} (250.0^\circ\text{C}):**</w:t>
       </w:r>
     </w:p>
     <w:p>
       <w:pPr>
-        <w:spacing w:before="80" w:after="80"/>
-        <w:jc w:val="center"/>
+        <w:pStyle w:val="ListBullet"/>
+        <w:spacing w:before="20" w:after="40"/>
       </w:pPr>
       <w:r>
         <w:rPr>
-          <w:i/>
-          <w:color w:val="475569"/>
+          <w:color w:val="1F2937"/>
           <w:sz w:val="20"/>
         </w:rPr>
-        <w:t>\ln K_{p,3} = 2.8953 \implies \mathbf{K_{p,3} = 18.0881}</w:t>
+        <w:t>**At T = 523.15\text{ K} (250.0^\circ\text{C}):** \ln K_{p,3} = 2.8953 \implies K_{p,3} = 18.0881</w:t>
       </w:r>
     </w:p>
     <w:p>
@@ -887,13 +998,22 @@
     </w:p>
     <w:p>
       <w:pPr>
-        <w:spacing w:before="80" w:after="80"/>
-        <w:jc w:val="center"/>
+        <w:spacing w:before="40" w:after="80"/>
       </w:pPr>
       <w:r>
         <w:rPr>
-          <w:i/>
-          <w:color w:val="475569"/>
+          <w:color w:val="1F2937"/>
+          <w:sz w:val="20"/>
+        </w:rPr>
+      </w:r>
+    </w:p>
+    <w:p>
+      <w:pPr>
+        <w:spacing w:before="40" w:after="80"/>
+      </w:pPr>
+      <w:r>
+        <w:rPr>
+          <w:color w:val="1F2937"/>
           <w:sz w:val="20"/>
         </w:rPr>
         <w:t>r_1 = \frac{k_1 p_{\text{CO}_2} p_{\text{H}_2} \left[ 1 - \frac{p_{\text{H}_2\text{O}} p_{\text{CH}_3\text{OH}}}{K_{eq1} p_{\text{H}_2}^3 p_{\text{CO}_2}} \right]}{D_k^3} \quad \left[\frac{\text{mol}}{\text{kg}_{\text{cat}}\cdot\text{s}}\right]</w:t>
@@ -901,16 +1021,47 @@
     </w:p>
     <w:p>
       <w:pPr>
-        <w:spacing w:before="80" w:after="80"/>
-        <w:jc w:val="center"/>
+        <w:spacing w:before="40" w:after="80"/>
       </w:pPr>
       <w:r>
         <w:rPr>
-          <w:i/>
-          <w:color w:val="475569"/>
+          <w:color w:val="1F2937"/>
+          <w:sz w:val="20"/>
+        </w:rPr>
+      </w:r>
+    </w:p>
+    <w:p>
+      <w:pPr>
+        <w:spacing w:before="40" w:after="80"/>
+      </w:pPr>
+      <w:r>
+        <w:rPr>
+          <w:color w:val="1F2937"/>
+          <w:sz w:val="20"/>
+        </w:rPr>
+      </w:r>
+    </w:p>
+    <w:p>
+      <w:pPr>
+        <w:spacing w:before="40" w:after="80"/>
+      </w:pPr>
+      <w:r>
+        <w:rPr>
+          <w:color w:val="1F2937"/>
           <w:sz w:val="20"/>
         </w:rPr>
         <w:t>r_2 = \frac{k_2 p_{\text{CO}_2} \left[ 1 - \frac{p_{\text{H}_2\text{O}} p_{\text{CO}}}{K_{eq2} p_{\text{H}_2} p_{\text{CO}_2}} \right]}{D_k} \quad \left[\frac{\text{mol}}{\text{kg}_{\text{cat}}\cdot\text{s}}\right]</w:t>
+      </w:r>
+    </w:p>
+    <w:p>
+      <w:pPr>
+        <w:spacing w:before="40" w:after="80"/>
+      </w:pPr>
+      <w:r>
+        <w:rPr>
+          <w:color w:val="1F2937"/>
+          <w:sz w:val="20"/>
+        </w:rPr>
       </w:r>
     </w:p>
     <w:p>
@@ -928,13 +1079,22 @@
     </w:p>
     <w:p>
       <w:pPr>
-        <w:spacing w:before="80" w:after="80"/>
-        <w:jc w:val="center"/>
+        <w:spacing w:before="40" w:after="80"/>
       </w:pPr>
       <w:r>
         <w:rPr>
-          <w:i/>
-          <w:color w:val="475569"/>
+          <w:color w:val="1F2937"/>
+          <w:sz w:val="20"/>
+        </w:rPr>
+      </w:r>
+    </w:p>
+    <w:p>
+      <w:pPr>
+        <w:spacing w:before="40" w:after="80"/>
+      </w:pPr>
+      <w:r>
+        <w:rPr>
+          <w:color w:val="1F2937"/>
           <w:sz w:val="20"/>
         </w:rPr>
         <w:t>D_k = 1 + K_{\text{H}_2\text{O},\text{H}_2} \left(\frac{p_{\text{H}_2\text{O}}}{p_{\text{H}_2}}\right) + \sqrt{K_{\text{H}_2} p_{\text{H}_2}} + K_{\text{H}_2\text{O}} p_{\text{H}_2\text{O}}</w:t>
@@ -942,6 +1102,17 @@
     </w:p>
     <w:p>
       <w:pPr>
+        <w:spacing w:before="40" w:after="80"/>
+      </w:pPr>
+      <w:r>
+        <w:rPr>
+          <w:color w:val="1F2937"/>
+          <w:sz w:val="20"/>
+        </w:rPr>
+      </w:r>
+    </w:p>
+    <w:p>
+      <w:pPr>
         <w:spacing w:before="160" w:after="60"/>
       </w:pPr>
       <w:r>
@@ -950,18 +1121,17 @@
           <w:color w:val="475569"/>
           <w:sz w:val="22"/>
         </w:rPr>
-        <w:t xml:space="preserve"> Temperature-Dependent Kinetic Parameters (R = 8.314462\text{ J}/(\text{mol}\cdot\text{K})):</w:t>
+        <w:t xml:space="preserve"> Temperature-Dependent Kinetic Parameters (R = 8.314 J/(mol·K)):</w:t>
       </w:r>
     </w:p>
     <w:p>
       <w:pPr>
-        <w:spacing w:before="80" w:after="80"/>
-        <w:jc w:val="center"/>
+        <w:pStyle w:val="ListBullet"/>
+        <w:spacing w:before="20" w:after="40"/>
       </w:pPr>
       <w:r>
         <w:rPr>
-          <w:i/>
-          <w:color w:val="475569"/>
+          <w:color w:val="1F2937"/>
           <w:sz w:val="20"/>
         </w:rPr>
         <w:t>k_1 = 1.07 \exp\left(\frac{40000}{R T}\right) \implies k_1(523.15\text{ K}) = 10547.79\text{ mol}/(\text{kg}_{\text{cat}}\cdot\text{s}\cdot\text{bar}^2)</w:t>
@@ -969,13 +1139,12 @@
     </w:p>
     <w:p>
       <w:pPr>
-        <w:spacing w:before="80" w:after="80"/>
-        <w:jc w:val="center"/>
+        <w:pStyle w:val="ListBullet"/>
+        <w:spacing w:before="20" w:after="40"/>
       </w:pPr>
       <w:r>
         <w:rPr>
-          <w:i/>
-          <w:color w:val="475569"/>
+          <w:color w:val="1F2937"/>
           <w:sz w:val="20"/>
         </w:rPr>
         <w:t>k_2 = 1.22 \times 10^{10} \exp\left(-\frac{98084}{R T}\right) \implies k_2(523.15\text{ K}) = 1.9643\text{ mol}/(\text{kg}_{\text{cat}}\cdot\text{s}\cdot\text{bar})</w:t>
@@ -983,13 +1152,12 @@
     </w:p>
     <w:p>
       <w:pPr>
-        <w:spacing w:before="80" w:after="80"/>
-        <w:jc w:val="center"/>
+        <w:pStyle w:val="ListBullet"/>
+        <w:spacing w:before="20" w:after="40"/>
       </w:pPr>
       <w:r>
         <w:rPr>
-          <w:i/>
-          <w:color w:val="475569"/>
+          <w:color w:val="1F2937"/>
           <w:sz w:val="20"/>
         </w:rPr>
         <w:t>K_{\text{H}_2\text{O}} = 6.62 \times 10^{-11} \exp\left(\frac{124119}{R T}\right) \implies K_{\text{H}_2\text{O}}(523.15\text{ K}) = 16.143\text{ bar}^{-1}</w:t>
@@ -997,13 +1165,12 @@
     </w:p>
     <w:p>
       <w:pPr>
-        <w:spacing w:before="80" w:after="80"/>
-        <w:jc w:val="center"/>
+        <w:pStyle w:val="ListBullet"/>
+        <w:spacing w:before="20" w:after="40"/>
       </w:pPr>
       <w:r>
         <w:rPr>
-          <w:i/>
-          <w:color w:val="475569"/>
+          <w:color w:val="1F2937"/>
           <w:sz w:val="20"/>
         </w:rPr>
         <w:t>\sqrt{K_{\text{H}_2}} = 0.499 \exp\left(\frac{17197}{R T}\right) \implies \sqrt{K_{\text{H}_2}}(523.15\text{ K}) = 2.628\text{ bar}^{-0.5}</w:t>
@@ -1011,16 +1178,15 @@
     </w:p>
     <w:p>
       <w:pPr>
-        <w:spacing w:before="80" w:after="80"/>
-        <w:jc w:val="center"/>
+        <w:pStyle w:val="ListBullet"/>
+        <w:spacing w:before="20" w:after="40"/>
       </w:pPr>
       <w:r>
         <w:rPr>
-          <w:i/>
-          <w:color w:val="475569"/>
+          <w:color w:val="1F2937"/>
           <w:sz w:val="20"/>
         </w:rPr>
-        <w:t>K_{\text{H}_2\text{O},\text{H}_2} = 3453.38 \quad [-]</w:t>
+        <w:t>K_{\text{H}_2\text{O},\text{H}_2} = 3453.38</w:t>
       </w:r>
     </w:p>
     <w:p>
@@ -1050,16 +1216,36 @@
     </w:p>
     <w:p>
       <w:pPr>
-        <w:spacing w:before="80" w:after="80"/>
-        <w:jc w:val="center"/>
+        <w:spacing w:before="40" w:after="80"/>
       </w:pPr>
       <w:r>
         <w:rPr>
-          <w:i/>
-          <w:color w:val="475569"/>
+          <w:color w:val="1F2937"/>
+          <w:sz w:val="20"/>
+        </w:rPr>
+      </w:r>
+    </w:p>
+    <w:p>
+      <w:pPr>
+        <w:spacing w:before="40" w:after="80"/>
+      </w:pPr>
+      <w:r>
+        <w:rPr>
+          <w:color w:val="1F2937"/>
           <w:sz w:val="20"/>
         </w:rPr>
         <w:t>r_3 = k_3 \left( \frac{p_{\text{CH}_3\text{OH}}^2}{p_{\text{H}_2\text{O},\text{safe}}} - \frac{p_{\text{DME}}}{K_{p,3}} \right) \quad \left[\frac{\text{mol}}{\text{kg}_{\text{cat}}\cdot\text{s}}\right]</w:t>
+      </w:r>
+    </w:p>
+    <w:p>
+      <w:pPr>
+        <w:spacing w:before="40" w:after="80"/>
+      </w:pPr>
+      <w:r>
+        <w:rPr>
+          <w:color w:val="1F2937"/>
+          <w:sz w:val="20"/>
+        </w:rPr>
       </w:r>
     </w:p>
     <w:p>
@@ -1077,13 +1263,22 @@
     </w:p>
     <w:p>
       <w:pPr>
-        <w:spacing w:before="80" w:after="80"/>
-        <w:jc w:val="center"/>
+        <w:spacing w:before="40" w:after="80"/>
       </w:pPr>
       <w:r>
         <w:rPr>
-          <w:i/>
-          <w:color w:val="475569"/>
+          <w:color w:val="1F2937"/>
+          <w:sz w:val="20"/>
+        </w:rPr>
+      </w:r>
+    </w:p>
+    <w:p>
+      <w:pPr>
+        <w:spacing w:before="40" w:after="80"/>
+      </w:pPr>
+      <w:r>
+        <w:rPr>
+          <w:color w:val="1F2937"/>
           <w:sz w:val="20"/>
         </w:rPr>
         <w:t>k_3 = 8.2894 \times 10^4 \exp\left(-\frac{5.2940 \times 10^4}{R T}\right) \quad \left[\frac{\text{kmol}}{\text{kg}_{\text{cat}}\cdot\text{s}\cdot\text{bar}}\right]</w:t>
@@ -1091,16 +1286,47 @@
     </w:p>
     <w:p>
       <w:pPr>
-        <w:spacing w:before="80" w:after="80"/>
-        <w:jc w:val="center"/>
+        <w:spacing w:before="40" w:after="80"/>
       </w:pPr>
       <w:r>
         <w:rPr>
-          <w:i/>
-          <w:color w:val="475569"/>
+          <w:color w:val="1F2937"/>
+          <w:sz w:val="20"/>
+        </w:rPr>
+      </w:r>
+    </w:p>
+    <w:p>
+      <w:pPr>
+        <w:spacing w:before="40" w:after="80"/>
+      </w:pPr>
+      <w:r>
+        <w:rPr>
+          <w:color w:val="1F2937"/>
+          <w:sz w:val="20"/>
+        </w:rPr>
+      </w:r>
+    </w:p>
+    <w:p>
+      <w:pPr>
+        <w:spacing w:before="40" w:after="80"/>
+      </w:pPr>
+      <w:r>
+        <w:rPr>
+          <w:color w:val="1F2937"/>
           <w:sz w:val="20"/>
         </w:rPr>
         <w:t>k_3 = 8.2894 \times 10^7 \exp\left(-\frac{5.2940 \times 10^4}{R T}\right) \quad \left[\frac{\text{mol}}{\text{kg}_{\text{cat}}\cdot\text{s}\cdot\text{bar}}\right]</w:t>
+      </w:r>
+    </w:p>
+    <w:p>
+      <w:pPr>
+        <w:spacing w:before="40" w:after="80"/>
+      </w:pPr>
+      <w:r>
+        <w:rPr>
+          <w:color w:val="1F2937"/>
+          <w:sz w:val="20"/>
+        </w:rPr>
       </w:r>
     </w:p>
     <w:p>
@@ -1126,21 +1352,7 @@
           <w:color w:val="1F2937"/>
           <w:sz w:val="20"/>
         </w:rPr>
-        <w:t>**Value at T = 523.15\text{ K} (250.0^\circ\text{C}):**</w:t>
-      </w:r>
-    </w:p>
-    <w:p>
-      <w:pPr>
-        <w:spacing w:before="80" w:after="80"/>
-        <w:jc w:val="center"/>
-      </w:pPr>
-      <w:r>
-        <w:rPr>
-          <w:i/>
-          <w:color w:val="475569"/>
-          <w:sz w:val="20"/>
-        </w:rPr>
-        <w:t>k_3 = \mathbf{429.2974\text{ mol}/(\text{kg}_{\text{cat}}\cdot\text{s}\cdot\text{bar})} = \mathbf{0.4293\text{ kmol}/(\text{kg}_{\text{cat}}\cdot\text{s}\cdot\text{bar})}</w:t>
+        <w:t>**Value at T = 523.15\text{ K} (250.0^\circ\text{C}):** k_3 = 429.2974\text{ mol}/(\text{kg}_{\text{cat}}\cdot\text{s}\cdot\text{bar}) = 0.4293\text{ kmol}/(\text{kg}_{\text{cat}}\cdot\text{s}\cdot\text{bar})</w:t>
       </w:r>
     </w:p>
     <w:p>
@@ -1153,21 +1365,7 @@
           <w:color w:val="1F2937"/>
           <w:sz w:val="20"/>
         </w:rPr>
-        <w:t>**Numerical Inlet Safeguard:**</w:t>
-      </w:r>
-    </w:p>
-    <w:p>
-      <w:pPr>
-        <w:spacing w:before="80" w:after="80"/>
-        <w:jc w:val="center"/>
-      </w:pPr>
-      <w:r>
-        <w:rPr>
-          <w:i/>
-          <w:color w:val="475569"/>
-          <w:sz w:val="20"/>
-        </w:rPr>
-        <w:t>p_{\text{H}_2\text{O},\text{safe}} = \max(p_{\text{H}_2\text{O}}, 10^{-6}\text{ bar})</w:t>
+        <w:t>**Numerical Inlet Safeguard:** p_{\text{H}_2\text{O},\text{safe}} = \max(p_{\text{H}_2\text{O}}, 10^{-6}\text{ bar})</w:t>
       </w:r>
     </w:p>
     <w:p>
@@ -1197,13 +1395,22 @@
     </w:p>
     <w:p>
       <w:pPr>
-        <w:spacing w:before="80" w:after="80"/>
-        <w:jc w:val="center"/>
+        <w:spacing w:before="40" w:after="80"/>
       </w:pPr>
       <w:r>
         <w:rPr>
-          <w:i/>
-          <w:color w:val="475569"/>
+          <w:color w:val="1F2937"/>
+          <w:sz w:val="20"/>
+        </w:rPr>
+      </w:r>
+    </w:p>
+    <w:p>
+      <w:pPr>
+        <w:spacing w:before="40" w:after="80"/>
+      </w:pPr>
+      <w:r>
+        <w:rPr>
+          <w:color w:val="1F2937"/>
           <w:sz w:val="20"/>
         </w:rPr>
         <w:t>\vec{y} = [\text{CO}_2, \text{H}_2, \text{H}_2\text{O}, \text{CH}_3\text{OH}, \text{CO}, \text{CH}_3\text{OCH}_3]^T</w:t>
@@ -1211,6 +1418,17 @@
     </w:p>
     <w:p>
       <w:pPr>
+        <w:spacing w:before="40" w:after="80"/>
+      </w:pPr>
+      <w:r>
+        <w:rPr>
+          <w:color w:val="1F2937"/>
+          <w:sz w:val="20"/>
+        </w:rPr>
+      </w:r>
+    </w:p>
+    <w:p>
+      <w:pPr>
         <w:spacing w:before="200" w:after="80"/>
       </w:pPr>
       <w:r>
@@ -1219,18 +1437,39 @@
           <w:color w:val="475569"/>
           <w:sz w:val="24"/>
         </w:rPr>
-        <w:t xml:space="preserve"> 5.1 Retentate Catalyst Channel Mass Balance (z \in [0, L])</w:t>
+        <w:t xml:space="preserve"> 5.1 Retentate Catalyst Channel Mass Balance</w:t>
       </w:r>
     </w:p>
     <w:p>
       <w:pPr>
-        <w:spacing w:before="80" w:after="80"/>
-        <w:jc w:val="center"/>
+        <w:spacing w:before="40" w:after="80"/>
       </w:pPr>
       <w:r>
         <w:rPr>
-          <w:i/>
-          <w:color w:val="475569"/>
+          <w:color w:val="1F2937"/>
+          <w:sz w:val="20"/>
+        </w:rPr>
+        <w:t>For z \in [0, L]:</w:t>
+      </w:r>
+    </w:p>
+    <w:p>
+      <w:pPr>
+        <w:spacing w:before="40" w:after="80"/>
+      </w:pPr>
+      <w:r>
+        <w:rPr>
+          <w:color w:val="1F2937"/>
+          <w:sz w:val="20"/>
+        </w:rPr>
+      </w:r>
+    </w:p>
+    <w:p>
+      <w:pPr>
+        <w:spacing w:before="40" w:after="80"/>
+      </w:pPr>
+      <w:r>
+        <w:rPr>
+          <w:color w:val="1F2937"/>
           <w:sz w:val="20"/>
         </w:rPr>
         <w:t>\frac{d F_{\text{ret},i}}{dz} = \rho_B A_c r_{\text{net},i} - J_i P_m</w:t>
@@ -1238,6 +1477,17 @@
     </w:p>
     <w:p>
       <w:pPr>
+        <w:spacing w:before="40" w:after="80"/>
+      </w:pPr>
+      <w:r>
+        <w:rPr>
+          <w:color w:val="1F2937"/>
+          <w:sz w:val="20"/>
+        </w:rPr>
+      </w:r>
+    </w:p>
+    <w:p>
+      <w:pPr>
         <w:spacing w:before="200" w:after="80"/>
       </w:pPr>
       <w:r>
@@ -1246,21 +1496,53 @@
           <w:color w:val="475569"/>
           <w:sz w:val="24"/>
         </w:rPr>
-        <w:t xml:space="preserve"> 5.2 Permeate Sweep Channel Mass Balance (z \in [0, L])</w:t>
+        <w:t xml:space="preserve"> 5.2 Permeate Sweep Channel Mass Balance</w:t>
       </w:r>
     </w:p>
     <w:p>
       <w:pPr>
-        <w:spacing w:before="80" w:after="80"/>
-        <w:jc w:val="center"/>
+        <w:spacing w:before="40" w:after="80"/>
       </w:pPr>
       <w:r>
         <w:rPr>
-          <w:i/>
-          <w:color w:val="475569"/>
+          <w:color w:val="1F2937"/>
+          <w:sz w:val="20"/>
+        </w:rPr>
+        <w:t>For z \in [0, L]:</w:t>
+      </w:r>
+    </w:p>
+    <w:p>
+      <w:pPr>
+        <w:spacing w:before="40" w:after="80"/>
+      </w:pPr>
+      <w:r>
+        <w:rPr>
+          <w:color w:val="1F2937"/>
+          <w:sz w:val="20"/>
+        </w:rPr>
+      </w:r>
+    </w:p>
+    <w:p>
+      <w:pPr>
+        <w:spacing w:before="40" w:after="80"/>
+      </w:pPr>
+      <w:r>
+        <w:rPr>
+          <w:color w:val="1F2937"/>
           <w:sz w:val="20"/>
         </w:rPr>
         <w:t>\frac{d F_{\text{perm},i}}{dz} = + J_i P_m</w:t>
+      </w:r>
+    </w:p>
+    <w:p>
+      <w:pPr>
+        <w:spacing w:before="40" w:after="80"/>
+      </w:pPr>
+      <w:r>
+        <w:rPr>
+          <w:color w:val="1F2937"/>
+          <w:sz w:val="20"/>
+        </w:rPr>
       </w:r>
     </w:p>
     <w:p>
@@ -1342,16 +1624,36 @@
     </w:p>
     <w:p>
       <w:pPr>
-        <w:spacing w:before="80" w:after="80"/>
-        <w:jc w:val="center"/>
+        <w:spacing w:before="40" w:after="80"/>
       </w:pPr>
       <w:r>
         <w:rPr>
-          <w:i/>
-          <w:color w:val="475569"/>
+          <w:color w:val="1F2937"/>
+          <w:sz w:val="20"/>
+        </w:rPr>
+      </w:r>
+    </w:p>
+    <w:p>
+      <w:pPr>
+        <w:spacing w:before="40" w:after="80"/>
+      </w:pPr>
+      <w:r>
+        <w:rPr>
+          <w:color w:val="1F2937"/>
           <w:sz w:val="20"/>
         </w:rPr>
         <w:t>J_i = \Pi_i (p_{\text{ret},i} - p_{\text{perm},i}) = \frac{\Pi_{\text{H}_2\text{O}}}{\alpha_i} \left( \frac{F_{\text{ret},i}}{\sum F_{\text{ret}}} P_{\text{ret}} - \frac{F_{\text{perm},i}}{\sum F_{\text{perm}} + F_{\text{sweep}}} P_{\text{perm}} \right)</w:t>
+      </w:r>
+    </w:p>
+    <w:p>
+      <w:pPr>
+        <w:spacing w:before="40" w:after="80"/>
+      </w:pPr>
+      <w:r>
+        <w:rPr>
+          <w:color w:val="1F2937"/>
+          <w:sz w:val="20"/>
+        </w:rPr>
       </w:r>
     </w:p>
     <w:p>
@@ -1431,7 +1733,7 @@
                 <w:color w:val="475569"/>
                 <w:sz w:val="19"/>
               </w:rPr>
-              <w:t>Permeance \Pi{\text{H}2\text{O}} (\text{mol}/(\text{m}^2\cdot\text{s}\cdot\text{Pa}))</w:t>
+              <w:t>Permeance \Pi{\text{H}2\text{O}} (mol/(m²·s·Pa))</w:t>
             </w:r>
           </w:p>
         </w:tc>
@@ -1456,7 +1758,7 @@
                 <w:color w:val="475569"/>
                 <w:sz w:val="19"/>
               </w:rPr>
-              <w:t>\alpha{\text{CO}2}</w:t>
+              <w:t>Selectivity \alpha{\text{CO}2}</w:t>
             </w:r>
           </w:p>
         </w:tc>
@@ -1481,7 +1783,7 @@
                 <w:color w:val="475569"/>
                 <w:sz w:val="19"/>
               </w:rPr>
-              <w:t>\alpha{\text{H}2}</w:t>
+              <w:t>Selectivity \alpha{\text{H}2}</w:t>
             </w:r>
           </w:p>
         </w:tc>
@@ -1506,7 +1808,7 @@
                 <w:color w:val="475569"/>
                 <w:sz w:val="19"/>
               </w:rPr>
-              <w:t>\alpha{\text{CH}3\text{OH}}</w:t>
+              <w:t>Selectivity \alpha{\text{CH}3\text{OH}}</w:t>
             </w:r>
           </w:p>
         </w:tc>
@@ -1531,7 +1833,7 @@
                 <w:color w:val="475569"/>
                 <w:sz w:val="19"/>
               </w:rPr>
-              <w:t>\alpha{\text{CO}}</w:t>
+              <w:t>Selectivity \alpha{\text{CO}}</w:t>
             </w:r>
           </w:p>
         </w:tc>
@@ -1556,7 +1858,7 @@
                 <w:color w:val="475569"/>
                 <w:sz w:val="19"/>
               </w:rPr>
-              <w:t>\alpha{\text{DME}}</w:t>
+              <w:t>Selectivity \alpha{\text{DME}}</w:t>
             </w:r>
           </w:p>
         </w:tc>
@@ -1626,7 +1928,7 @@
                 <w:color w:val="1F2937"/>
                 <w:sz w:val="18"/>
               </w:rPr>
-              <w:t>1.8 \times 10^{-7}</w:t>
+              <w:t>1.8 × 10⁻⁷</w:t>
             </w:r>
           </w:p>
         </w:tc>
@@ -1809,7 +2111,7 @@
                 <w:color w:val="1F2937"/>
                 <w:sz w:val="18"/>
               </w:rPr>
-              <w:t>2.0 \times 10^{-7}</w:t>
+              <w:t>2.0 × 10⁻⁷</w:t>
             </w:r>
           </w:p>
         </w:tc>
@@ -1992,7 +2294,7 @@
                 <w:color w:val="1F2937"/>
                 <w:sz w:val="18"/>
               </w:rPr>
-              <w:t>0.6 \times 10^{-7}</w:t>
+              <w:t>0.6 × 10⁻⁷</w:t>
             </w:r>
           </w:p>
         </w:tc>
@@ -2152,16 +2454,36 @@
     </w:p>
     <w:p>
       <w:pPr>
-        <w:spacing w:before="80" w:after="80"/>
-        <w:jc w:val="center"/>
+        <w:spacing w:before="40" w:after="80"/>
       </w:pPr>
       <w:r>
         <w:rPr>
-          <w:i/>
-          <w:color w:val="475569"/>
+          <w:color w:val="1F2937"/>
+          <w:sz w:val="20"/>
+        </w:rPr>
+      </w:r>
+    </w:p>
+    <w:p>
+      <w:pPr>
+        <w:spacing w:before="40" w:after="80"/>
+      </w:pPr>
+      <w:r>
+        <w:rPr>
+          <w:color w:val="1F2937"/>
           <w:sz w:val="20"/>
         </w:rPr>
         <w:t>\frac{\Delta P}{L} = 150 \frac{\mu_g (1 - \varepsilon_b)^2}{\varepsilon_b^3 d_p^2} u_s + 1.75 \frac{\rho_g (1 - \varepsilon_b)}{\varepsilon_b^3 d_p} u_s^2</w:t>
+      </w:r>
+    </w:p>
+    <w:p>
+      <w:pPr>
+        <w:spacing w:before="40" w:after="80"/>
+      </w:pPr>
+      <w:r>
+        <w:rPr>
+          <w:color w:val="1F2937"/>
+          <w:sz w:val="20"/>
+        </w:rPr>
       </w:r>
     </w:p>
     <w:p>
@@ -2178,16 +2500,36 @@
     </w:p>
     <w:p>
       <w:pPr>
-        <w:spacing w:before="80" w:after="80"/>
-        <w:jc w:val="center"/>
+        <w:spacing w:before="40" w:after="80"/>
       </w:pPr>
       <w:r>
         <w:rPr>
-          <w:i/>
-          <w:color w:val="475569"/>
+          <w:color w:val="1F2937"/>
           <w:sz w:val="20"/>
         </w:rPr>
-        <w:t>\frac{\Delta P}{L} = 3373\text{ Pa/m} \implies \Delta P(L = 1.0\text{ m}) = \mathbf{0.0337\text{ bar}} \quad (\mathbf{0.08\%} \text{ of } 40\text{ bar})</w:t>
+      </w:r>
+    </w:p>
+    <w:p>
+      <w:pPr>
+        <w:spacing w:before="40" w:after="80"/>
+      </w:pPr>
+      <w:r>
+        <w:rPr>
+          <w:color w:val="1F2937"/>
+          <w:sz w:val="20"/>
+        </w:rPr>
+        <w:t>\frac{\Delta P}{L} = 3373\text{ Pa/m} \implies \Delta P(L = 1.0\text{ m}) = 0.0337\text{ bar} \quad (0.08\% \text{ of } 40\text{ bar})</w:t>
+      </w:r>
+    </w:p>
+    <w:p>
+      <w:pPr>
+        <w:spacing w:before="40" w:after="80"/>
+      </w:pPr>
+      <w:r>
+        <w:rPr>
+          <w:color w:val="1F2937"/>
+          <w:sz w:val="20"/>
+        </w:rPr>
       </w:r>
     </w:p>
     <w:p>
@@ -2250,7 +2592,7 @@
           <w:color w:val="1F2937"/>
           <w:sz w:val="20"/>
         </w:rPr>
-        <w:t>**The Classical Limitation:** In a closed system at constant  and , chemical equilibrium is reached when the Gibbs free energy of the mixture is minimized (\Delta G = 0). The chemical affinity (\mathcal{A}) driving any reaction  is defined by:</w:t>
+        <w:t>**The Classical Limitation:** In a closed system at constant T and P, chemical equilibrium is reached when the Gibbs free energy of the mixture is minimized (\Delta G = 0). The chemical affinity (\mathcal{A}) driving any reaction j is defined by de Donder's formulation:</w:t>
       </w:r>
     </w:p>
     <w:p>
@@ -2262,7 +2604,6 @@
           <w:color w:val="1F2937"/>
           <w:sz w:val="20"/>
         </w:rPr>
-        <w:t>9325\mathcal{A}_j = -\sum_{i}</w:t>
       </w:r>
     </w:p>
     <w:p>
@@ -2274,7 +2615,7 @@
           <w:color w:val="1F2937"/>
           <w:sz w:val="20"/>
         </w:rPr>
-        <w:t>u_{i,j} \mu_i = R T \ln\left( rac{K_{eq,j}}{Q_j}</w:t>
+        <w:t>\mathcal{A}_j = -\sum_{i} \nu_{i,j} \mu_i = R T \ln\left( \frac{K_{eq,j}}{Q_j} \right)</w:t>
       </w:r>
     </w:p>
     <w:p>
@@ -2286,7 +2627,6 @@
           <w:color w:val="1F2937"/>
           <w:sz w:val="20"/>
         </w:rPr>
-        <w:t>ight)9325</w:t>
       </w:r>
     </w:p>
     <w:p>
@@ -2298,19 +2638,20 @@
           <w:color w:val="1F2937"/>
           <w:sz w:val="20"/>
         </w:rPr>
-        <w:t xml:space="preserve">Where \mu_i is the chemical potential of species , </w:t>
+        <w:t>Where \mu_i is the chemical potential of species i, \nu_{i,j} is its stoichiometric coefficient, and Q_j = \prod p_i^{\nu_{i,j}} is the reaction quotient.</w:t>
       </w:r>
     </w:p>
     <w:p>
       <w:pPr>
-        <w:spacing w:before="40" w:after="80"/>
+        <w:pStyle w:val="ListBullet"/>
+        <w:spacing w:before="20" w:after="40"/>
       </w:pPr>
       <w:r>
         <w:rPr>
           <w:color w:val="1F2937"/>
           <w:sz w:val="20"/>
         </w:rPr>
-        <w:t>u_{i,j} is its stoichiometric coefficient, and  = \prod p_i^{</w:t>
+        <w:t>**The Traditional Packed Bed Failure:** In a standard packed bed, as reactants convert, water partial pressure accumulates rapidly (p_{\text{H}_2\text{O}} \to 3.2\text{ bar}). As a result, the reaction quotients surge toward their equilibrium limits:</w:t>
       </w:r>
     </w:p>
     <w:p>
@@ -2322,22 +2663,18 @@
           <w:color w:val="1F2937"/>
           <w:sz w:val="20"/>
         </w:rPr>
-        <w:t>u_{i,j}} is the reaction quotient.</w:t>
       </w:r>
     </w:p>
     <w:p>
       <w:pPr>
-        <w:pStyle w:val="ListBullet"/>
-        <w:spacing w:before="20" w:after="40"/>
+        <w:spacing w:before="40" w:after="80"/>
       </w:pPr>
       <w:r>
         <w:rPr>
           <w:color w:val="1F2937"/>
           <w:sz w:val="20"/>
         </w:rPr>
-        <w:t xml:space="preserve">**The Traditional Packed Bed Failure:** In a standard packed bed, as reactants convert, water partial pressure accumulates rapidly ({\mathrm{H}_2\mathrm{O}} </w:t>
-        <w:tab/>
-        <w:t>o 3.2\ \mathrm{bar}). As a result, the reaction quotients surge toward their equilibrium limits:</w:t>
+        <w:t>Q_1 = \frac{p_{\text{H}_2\text{O}} p_{\text{CH}_3\text{OH}}}{p_{\text{H}_2}^3 p_{\text{CO}_2}} \to K_{eq1}, \quad Q_3 = \frac{p_{\text{DME}} p_{\text{H}_2\text{O}}}{p_{\text{CH}_3\text{OH}}^2} \to K_{p,3}</w:t>
       </w:r>
     </w:p>
     <w:p>
@@ -2349,11 +2686,6 @@
           <w:color w:val="1F2937"/>
           <w:sz w:val="20"/>
         </w:rPr>
-        <w:t xml:space="preserve">9325Q_1 = rac{p_{\mathrm{H}_2\mathrm{O}} p_{\mathrm{CH}_3\mathrm{OH}}}{p_{\mathrm{H}_2}^3 p_{\mathrm{CO}_2}} </w:t>
-        <w:tab/>
-        <w:t xml:space="preserve">o K_{eq1}, \quad Q_3 = rac{p_{\mathrm{DME}} p_{\mathrm{H}_2\mathrm{O}}}{p_{\mathrm{CH}_3\mathrm{OH}}^2} </w:t>
-        <w:tab/>
-        <w:t>o K_{p,3}9325</w:t>
       </w:r>
     </w:p>
     <w:p>
@@ -2365,13 +2697,7 @@
           <w:color w:val="1F2937"/>
           <w:sz w:val="20"/>
         </w:rPr>
-        <w:t xml:space="preserve">When  </w:t>
-        <w:tab/>
-        <w:t xml:space="preserve">o K_{eq,j}, the affinity collapses to zero (\mathcal{A}_j </w:t>
-        <w:tab/>
-        <w:t xml:space="preserve">o 0), driving the net forward reaction rate to zero ({\mathrm{net},j} </w:t>
-        <w:tab/>
-        <w:t>o 0). Single-pass conversion is thus choked at .99\%, and DME yield cannot exceed .65\%.</w:t>
+        <w:t>When Q_j \to K_{eq,j}, the affinity collapses to zero (\mathcal{A}_j \to 0), driving the net forward reaction rate to zero (r_{\text{net},j} \to 0). Single-pass conversion is thus choked at 28.99\%, and DME yield cannot exceed 19.65\%.</w:t>
       </w:r>
     </w:p>
     <w:p>
@@ -2384,7 +2710,7 @@
           <w:color w:val="1F2937"/>
           <w:sz w:val="20"/>
         </w:rPr>
-        <w:t>**The Membrane Reactor Remedy:** By maintaining continuous in-situ water removal across the NaA zeolite layer ({\mathrm{H}_2\mathrm{O}} = \Pi_{\mathrm{H}_2\mathrm{O}} \Delta p_{\mathrm{H}_2\mathrm{O}}), the water partial pressure is suppressed along the entire bed ({\mathrm{H}_2\mathrm{O}} &lt; 0.15\ \mathrm{bar}). Consequently:</w:t>
+        <w:t>**The Membrane Reactor Remedy:** By maintaining continuous in-situ water removal across the NaA zeolite layer (J_{\text{H}_2\text{O}} = \Pi_{\text{H}_2\text{O}} \Delta p_{\text{H}_2\text{O}}), the water partial pressure is suppressed along the entire bed (p_{\text{H}_2\text{O}} &lt; 0.15\text{ bar}). Consequently:</w:t>
       </w:r>
     </w:p>
     <w:p>
@@ -2396,7 +2722,6 @@
           <w:color w:val="1F2937"/>
           <w:sz w:val="20"/>
         </w:rPr>
-        <w:t>9325Q_j \ll K_{eq,j} \implies \mathcal{A}_j = R T \ln\left( rac{K_{eq,j}}{Q_j}</w:t>
       </w:r>
     </w:p>
     <w:p>
@@ -2408,7 +2733,7 @@
           <w:color w:val="1F2937"/>
           <w:sz w:val="20"/>
         </w:rPr>
-        <w:t>ight) \gg 09325</w:t>
+        <w:t>Q_j \ll K_{eq,j} \implies \mathcal{A}_j = R T \ln\left( \frac{K_{eq,j}}{Q_j} \right) \gg 0</w:t>
       </w:r>
     </w:p>
     <w:p>
@@ -2420,7 +2745,18 @@
           <w:color w:val="1F2937"/>
           <w:sz w:val="20"/>
         </w:rPr>
-        <w:t>A strong positive thermodynamic affinity is maintained from inlet to outlet, permanently bypassing the classical Gibbs ceiling (.54\%) and driving DME single-pass yield to **.16\%*.</w:t>
+      </w:r>
+    </w:p>
+    <w:p>
+      <w:pPr>
+        <w:spacing w:before="40" w:after="80"/>
+      </w:pPr>
+      <w:r>
+        <w:rPr>
+          <w:color w:val="1F2937"/>
+          <w:sz w:val="20"/>
+        </w:rPr>
+        <w:t>A strong positive thermodynamic affinity is maintained from inlet to outlet, permanently bypassing the classical Gibbs ceiling (46.54\%) and driving DME single-pass yield to **86.16\%**.</w:t>
       </w:r>
     </w:p>
     <w:p>
@@ -2459,15 +2795,7 @@
           <w:color w:val="1F2937"/>
           <w:sz w:val="20"/>
         </w:rPr>
-        <w:t>Metallic copper crystallites (</w:t>
-        <w:tab/>
-        <w:t xml:space="preserve">ext{Cu}^0) supported on </w:t>
-        <w:tab/>
-        <w:t>ext{ZnO/Al}_2</w:t>
-        <w:tab/>
-        <w:t xml:space="preserve">ext{O}_3 for </w:t>
-        <w:tab/>
-        <w:t>ext{CO}_2 dissociative adsorption and hydrogenative formation of methoxy intermediates.</w:t>
+        <w:t>Metallic copper crystallites (\text{Cu}^0) supported on \text{ZnO/Al}_2\text{O}_3 for \text{CO}_2 dissociative adsorption and hydrogenative formation of methoxy intermediates.</w:t>
       </w:r>
     </w:p>
     <w:p>
@@ -2480,11 +2808,7 @@
           <w:color w:val="1F2937"/>
           <w:sz w:val="20"/>
         </w:rPr>
-        <w:t xml:space="preserve">Solid acid Brønsted sites (bridging hydroxyls </w:t>
-        <w:tab/>
-        <w:t xml:space="preserve">ext{Si-OH-Al}) in </w:t>
-        <w:tab/>
-        <w:t>ext{H-ZSM-5} zeolite channels for the proton-catalyzed bimolecular condensation of methanol into DME.</w:t>
+        <w:t>Solid acid Brønsted sites (bridging hydroxyls \text{Si-OH-Al}) in \text{H-ZSM-5} zeolite channels for the proton-catalyzed bimolecular condensation of methanol into DME.</w:t>
       </w:r>
     </w:p>
     <w:p>
@@ -2521,7 +2845,6 @@
           <w:color w:val="1F2937"/>
           <w:sz w:val="20"/>
         </w:rPr>
-        <w:t>9325D_k = 1 + K_{\mathrm{H}_2\mathrm{O},\mathrm{H}_2}\left(rac{p_{\mathrm{H}_2\mathrm{O}}}{p_{\mathrm{H}_2}}</w:t>
       </w:r>
     </w:p>
     <w:p>
@@ -2533,7 +2856,7 @@
           <w:color w:val="1F2937"/>
           <w:sz w:val="20"/>
         </w:rPr>
-        <w:t>ight) + \sqrt{K_{\mathrm{H}_2} p_{\mathrm{H}_2}} + K_{\mathrm{H}_2\mathrm{O}} p_{\mathrm{H}_2\mathrm{O}}9325</w:t>
+        <w:t>D_k = 1 + K_{\text{H}_2\text{O},\text{H}_2}\left(\frac{p_{\text{H}_2\text{O}}}{p_{\text{H}_2}}\right) + \sqrt{K_{\text{H}_2} p_{\text{H}_2}} + K_{\text{H}_2\text{O}} p_{\text{H}_2\text{O}}</w:t>
       </w:r>
     </w:p>
     <w:p>
@@ -2545,32 +2868,31 @@
           <w:color w:val="1F2937"/>
           <w:sz w:val="20"/>
         </w:rPr>
-        <w:t>Because water adsorbs strongly onto copper ({\mathrm{H}_2\mathrm{O}} = 16.14\ \mathrm{bar}^{-1} at ^\circ\mathrm{C}), high water partial pressures cause  to swell. Because the forward rate depends inversely on the cube of the denominator ( \propto 1/D_k^3), accumulated water blocks copper active sites, causing reaction rates to collapse by over \% in a traditional bed.</w:t>
       </w:r>
     </w:p>
     <w:p>
       <w:pPr>
-        <w:pStyle w:val="ListBullet"/>
-        <w:spacing w:before="20" w:after="40"/>
+        <w:spacing w:before="40" w:after="80"/>
       </w:pPr>
       <w:r>
         <w:rPr>
           <w:color w:val="1F2937"/>
           <w:sz w:val="20"/>
         </w:rPr>
-        <w:t xml:space="preserve">**Why Water Destroys Zeolite Acidity:** Under elevated temperature (^\circ\mathrm{C}) and high steam partial pressure, water molecules induce hydrolytic cleavage of framework tetrahedral aluminum atoms (dealumination: </w:t>
-        <w:tab/>
-        <w:t xml:space="preserve">ext{Si-O-Al} + </w:t>
-        <w:tab/>
-        <w:t>ext{H}_2</w:t>
-        <w:tab/>
-        <w:t xml:space="preserve">ext{O} </w:t>
-        <w:tab/>
-        <w:t xml:space="preserve">o </w:t>
-        <w:tab/>
-        <w:t xml:space="preserve">ext{Si-OH} + </w:t>
-        <w:tab/>
-        <w:t>ext{Al-OH}). This irreversible process permanently degrades the Brønsted acid sites. In-situ extraction preserves zeolite framework integrity.</w:t>
+        <w:t>Because water adsorbs strongly onto copper (K_{\text{H}_2\text{O}} = 16.14\text{ bar}^{-1} at 250^\circ\text{C}), high water partial pressures cause D_k to swell. Because the forward rate depends inversely on the cube of the denominator (r_1 \propto 1/D_k^3), accumulated water blocks copper active sites, causing reaction rates to collapse by over 80\% in a traditional bed.</w:t>
+      </w:r>
+    </w:p>
+    <w:p>
+      <w:pPr>
+        <w:pStyle w:val="ListBullet"/>
+        <w:spacing w:before="20" w:after="40"/>
+      </w:pPr>
+      <w:r>
+        <w:rPr>
+          <w:color w:val="1F2937"/>
+          <w:sz w:val="20"/>
+        </w:rPr>
+        <w:t>**Why Water Destroys Zeolite Acidity:** Under elevated temperature (250^\circ\text{C}) and high steam partial pressure, water molecules induce hydrolytic cleavage of framework tetrahedral aluminum atoms (dealumination: \text{Si-O-Al} + \text{H}_2\text{O} \to \text{Si-OH} + \text{Al-OH}). This irreversible process permanently degrades the Brønsted acid sites. In-situ extraction preserves zeolite framework integrity.</w:t>
       </w:r>
     </w:p>
     <w:p>
@@ -2607,7 +2929,6 @@
           <w:color w:val="1F2937"/>
           <w:sz w:val="20"/>
         </w:rPr>
-        <w:t>9325r_3 = k_3 \left( rac{p_{\mathrm{CH}_3\mathrm{OH}}^2}{p_{\mathrm{H}_2\mathrm{O},\mathrm{safe}}} - rac{p_{\mathrm{DME}}}{K_{p,3}}</w:t>
       </w:r>
     </w:p>
     <w:p>
@@ -2619,7 +2940,7 @@
           <w:color w:val="1F2937"/>
           <w:sz w:val="20"/>
         </w:rPr>
-        <w:t>ight)9325</w:t>
+        <w:t>r_3 = k_3 \left( \frac{p_{\text{CH}_3\text{OH}}^2}{p_{\text{H}_2\text{O},\text{safe}}} - \frac{p_{\text{DME}}}{K_{p,3}} \right)</w:t>
       </w:r>
     </w:p>
     <w:p>
@@ -2631,7 +2952,18 @@
           <w:color w:val="1F2937"/>
           <w:sz w:val="20"/>
         </w:rPr>
-        <w:t>Factoring {\mathrm{H}_2\mathrm{O}} into the denominator of the driving force explicitly accounts for competitive site adsorption between methanol and water on the Brønsted acid sites, accurately reproducing experimental behavior across wide pressure and temperature ranges.</w:t>
+      </w:r>
+    </w:p>
+    <w:p>
+      <w:pPr>
+        <w:spacing w:before="40" w:after="80"/>
+      </w:pPr>
+      <w:r>
+        <w:rPr>
+          <w:color w:val="1F2937"/>
+          <w:sz w:val="20"/>
+        </w:rPr>
+        <w:t>Factoring p_{\text{H}_2\text{O}} into the denominator of the driving force explicitly accounts for competitive site adsorption between methanol and water on the Brønsted acid sites, accurately reproducing experimental behavior across wide pressure and temperature ranges.</w:t>
       </w:r>
     </w:p>
     <w:p>
@@ -2657,7 +2989,7 @@
           <w:color w:val="1F2937"/>
           <w:sz w:val="20"/>
         </w:rPr>
-        <w:t>**Damköhler Number Synchronization ({\mathrm{perm}} pprox 1.0):**</w:t>
+        <w:t>**Damköhler Number Synchronization (Da_{\text{perm}} \approx 1.0):**</w:t>
       </w:r>
     </w:p>
     <w:p>
@@ -2681,37 +3013,29 @@
           <w:color w:val="1F2937"/>
           <w:sz w:val="20"/>
         </w:rPr>
-        <w:t>9325Da_{\mathrm{perm}} = rac{</w:t>
-        <w:tab/>
-        <w:t>au_{\mathrm{perm}}}{</w:t>
-        <w:tab/>
-        <w:t>au_{\mathrm{rxn}}} = rac{r_{\mathrm{gen},\mathrm{H}_2\mathrm{O}}}{J_{\mathrm{perm},\mathrm{H}_2\mathrm{O}} \cdot a_v}9325</w:t>
       </w:r>
     </w:p>
     <w:p>
       <w:pPr>
-        <w:pStyle w:val="ListBullet"/>
-        <w:spacing w:before="20" w:after="40"/>
+        <w:spacing w:before="40" w:after="80"/>
       </w:pPr>
       <w:r>
         <w:rPr>
           <w:color w:val="1F2937"/>
           <w:sz w:val="20"/>
         </w:rPr>
-        <w:t>If {\mathrm{perm}} \gg 1: The reactor is **permeation-limited**. Chemical generation outpaces extraction; water builds up, and the membrane becomes a redundant, high-cost bottleneck.</w:t>
+        <w:t>Da_{\text{perm}} = \frac{\tau_{\text{perm}}}{\tau_{\text{rxn}}} = \frac{r_{\text{gen},\text{H}_2\text{O}}}{J_{\text{perm},\text{H}_2\text{O}} \cdot a_v}</w:t>
       </w:r>
     </w:p>
     <w:p>
       <w:pPr>
-        <w:pStyle w:val="ListBullet"/>
-        <w:spacing w:before="20" w:after="40"/>
+        <w:spacing w:before="40" w:after="80"/>
       </w:pPr>
       <w:r>
         <w:rPr>
           <w:color w:val="1F2937"/>
           <w:sz w:val="20"/>
         </w:rPr>
-        <w:t>If {\mathrm{perm}} \ll 1: The reactor is **reaction-limited**. Membrane surface area is oversized, leading to excessive capital expense without incremental chemical gain.</w:t>
       </w:r>
     </w:p>
     <w:p>
@@ -2724,11 +3048,33 @@
           <w:color w:val="1F2937"/>
           <w:sz w:val="20"/>
         </w:rPr>
-        <w:t>At {\mathrm{perm}} pprox 0.98</w:t>
-        <w:tab/>
-        <w:t xml:space="preserve">ext{--}1.05: **Intensified synchronization** is achieved in the Four-Tube Shell-Packed CMR at </w:t>
-        <w:tab/>
-        <w:t>ext{GHSV} = 1000\ \mathrm{h}^{-1}, evacuating water at the exact rate it is generated (.53\% removal).</w:t>
+        <w:t>If Da_{\text{perm}} \gg 1: The reactor is **permeation-limited**. Chemical generation outpaces extraction; water builds up, and the membrane becomes a redundant, high-cost bottleneck.</w:t>
+      </w:r>
+    </w:p>
+    <w:p>
+      <w:pPr>
+        <w:pStyle w:val="ListBullet"/>
+        <w:spacing w:before="20" w:after="40"/>
+      </w:pPr>
+      <w:r>
+        <w:rPr>
+          <w:color w:val="1F2937"/>
+          <w:sz w:val="20"/>
+        </w:rPr>
+        <w:t>If Da_{\text{perm}} \ll 1: The reactor is **reaction-limited**. Membrane surface area is oversized, leading to excessive capital expense without incremental chemical gain.</w:t>
+      </w:r>
+    </w:p>
+    <w:p>
+      <w:pPr>
+        <w:pStyle w:val="ListBullet"/>
+        <w:spacing w:before="20" w:after="40"/>
+      </w:pPr>
+      <w:r>
+        <w:rPr>
+          <w:color w:val="1F2937"/>
+          <w:sz w:val="20"/>
+        </w:rPr>
+        <w:t>At Da_{\text{perm}} \approx 0.98\text{ to }1.05: **Intensified synchronization** is achieved in the Four-Tube Shell-Packed CMR at \text{GHSV} = 1000\text{ h}^{-1}, evacuating water at the exact rate it is generated (99.53\% removal).</w:t>
       </w:r>
     </w:p>
     <w:p>
@@ -2753,9 +3099,7 @@
           <w:color w:val="1F2937"/>
           <w:sz w:val="20"/>
         </w:rPr>
-        <w:t>In a packed bed, generated water molecules must diffuse through the tortuous interstitial fluid to reach the membrane wall. The characteristic diffusion timescale (</w:t>
-        <w:tab/>
-        <w:t>au_{\mathrm{diff}}) scales quadratically with the maximum diffusion path length:</w:t>
+        <w:t>In a packed bed, generated water molecules must diffuse through the tortuous interstitial fluid to reach the membrane wall. The characteristic diffusion timescale (\tau_{\text{diff}}) scales quadratically with the maximum diffusion path length:</w:t>
       </w:r>
     </w:p>
     <w:p>
@@ -2767,63 +3111,55 @@
           <w:color w:val="1F2937"/>
           <w:sz w:val="20"/>
         </w:rPr>
-        <w:t>9325</w:t>
-        <w:tab/>
-        <w:t>au_{\mathrm{diff}} = rac{(\Delta r_{\max})^2}{D_{\mathrm{eff}}}9325</w:t>
       </w:r>
     </w:p>
     <w:p>
       <w:pPr>
-        <w:pStyle w:val="ListBullet"/>
-        <w:spacing w:before="20" w:after="40"/>
+        <w:spacing w:before="40" w:after="80"/>
       </w:pPr>
       <w:r>
         <w:rPr>
           <w:color w:val="1F2937"/>
           <w:sz w:val="20"/>
         </w:rPr>
-        <w:t>In the Single-Tube CMR: \Delta r_{\max} = 5.00\ \mathrm{mm}.</w:t>
+        <w:t>\tau_{\text{diff}} = \frac{(\Delta r_{\max})^2}{D_{\text{eff}}}</w:t>
       </w:r>
     </w:p>
     <w:p>
       <w:pPr>
-        <w:pStyle w:val="ListBullet"/>
-        <w:spacing w:before="20" w:after="40"/>
+        <w:spacing w:before="40" w:after="80"/>
       </w:pPr>
       <w:r>
         <w:rPr>
           <w:color w:val="1F2937"/>
           <w:sz w:val="20"/>
         </w:rPr>
-        <w:t>In the Four-Tube Shell-Packed CMR: \Delta r_{\max} = 2.50\ \mathrm{mm} (halved).</w:t>
       </w:r>
     </w:p>
     <w:p>
       <w:pPr>
-        <w:spacing w:before="40" w:after="80"/>
+        <w:pStyle w:val="ListBullet"/>
+        <w:spacing w:before="20" w:after="40"/>
       </w:pPr>
       <w:r>
         <w:rPr>
           <w:color w:val="1F2937"/>
           <w:sz w:val="20"/>
         </w:rPr>
-        <w:t>9325rac{</w:t>
-        <w:tab/>
-        <w:t>au_{\mathrm{diff,4-tube}}}{</w:t>
-        <w:tab/>
-        <w:t>au_{\mathrm{diff,1-tube}}} = \left(rac{2.50}{5.00}</w:t>
+        <w:t>In the Single-Tube CMR: \Delta r_{\max} = 5.00\text{ mm}.</w:t>
       </w:r>
     </w:p>
     <w:p>
       <w:pPr>
-        <w:spacing w:before="40" w:after="80"/>
+        <w:pStyle w:val="ListBullet"/>
+        <w:spacing w:before="20" w:after="40"/>
       </w:pPr>
       <w:r>
         <w:rPr>
           <w:color w:val="1F2937"/>
           <w:sz w:val="20"/>
         </w:rPr>
-        <w:t>ight)^2 = rac{1}{4} = \mathbf{0.25}9325</w:t>
+        <w:t>In the Four-Tube Shell-Packed CMR: \Delta r_{\max} = 2.50\text{ mm} (halved).</w:t>
       </w:r>
     </w:p>
     <w:p>
@@ -2835,26 +3171,18 @@
           <w:color w:val="1F2937"/>
           <w:sz w:val="20"/>
         </w:rPr>
-        <w:t>By cutting the radial path in half, the diffusion timescale is reduced by a factor of **.0</w:t>
-        <w:tab/>
-        <w:t xml:space="preserve">imes*. Water molecules escape into the membrane </w:t>
-        <w:tab/>
-        <w:t>imes faster, preventing localized water accumulation near the shell wall.</w:t>
       </w:r>
     </w:p>
     <w:p>
       <w:pPr>
-        <w:pStyle w:val="ListBullet"/>
-        <w:spacing w:before="20" w:after="40"/>
+        <w:spacing w:before="40" w:after="80"/>
       </w:pPr>
       <w:r>
         <w:rPr>
           <w:color w:val="1F2937"/>
           <w:sz w:val="20"/>
         </w:rPr>
-        <w:t>**Specific Area Intensification ( = 2.0</w:t>
-        <w:tab/>
-        <w:t>imes):**</w:t>
+        <w:t>\frac{\tau_{\text{diff,4-tube}}}{\tau_{\text{diff,1-tube}}} = \left(\frac{2.50}{5.00}\right)^2 = \frac{1}{4} = 0.25</w:t>
       </w:r>
     </w:p>
     <w:p>
@@ -2866,11 +3194,43 @@
           <w:color w:val="1F2937"/>
           <w:sz w:val="20"/>
         </w:rPr>
-        <w:t xml:space="preserve">Specific surface area is defined as  = P_m / A_c. Subdividing the membrane into four half-radius tubes ( = 5\ \mathrm{mm}) doubles the membrane perimeter (: 31.42 </w:t>
-        <w:tab/>
-        <w:t xml:space="preserve">o 62.83\ \mathrm{mm}) while keeping bed area identical ( = 2.3562\ \mathrm{cm}^2). This doubles specific membrane area (: 133.33 </w:t>
-        <w:tab/>
-        <w:t>o 266.67\ \mathrm{m}^{-1}), providing twice the mass-transfer contact area per cubic centimeter of catalyst.</w:t>
+      </w:r>
+    </w:p>
+    <w:p>
+      <w:pPr>
+        <w:spacing w:before="40" w:after="80"/>
+      </w:pPr>
+      <w:r>
+        <w:rPr>
+          <w:color w:val="1F2937"/>
+          <w:sz w:val="20"/>
+        </w:rPr>
+        <w:t>By cutting the radial path in half, the diffusion timescale is reduced by a factor of **4.0×**. Water molecules escape into the membrane 4× faster, preventing localized water accumulation near the shell wall.</w:t>
+      </w:r>
+    </w:p>
+    <w:p>
+      <w:pPr>
+        <w:pStyle w:val="ListBullet"/>
+        <w:spacing w:before="20" w:after="40"/>
+      </w:pPr>
+      <w:r>
+        <w:rPr>
+          <w:color w:val="1F2937"/>
+          <w:sz w:val="20"/>
+        </w:rPr>
+        <w:t>**Specific Area Intensification (a_v = 2.0\times):**</w:t>
+      </w:r>
+    </w:p>
+    <w:p>
+      <w:pPr>
+        <w:spacing w:before="40" w:after="80"/>
+      </w:pPr>
+      <w:r>
+        <w:rPr>
+          <w:color w:val="1F2937"/>
+          <w:sz w:val="20"/>
+        </w:rPr>
+        <w:t>Specific surface area is defined as a_v = P_m / A_c. Subdividing the membrane into four half-radius tubes (d_t = 5\text{ mm}) doubles the membrane perimeter (P_m: 31.42 \to 62.83\text{ mm}) while keeping bed area identical (A_c = 2.3562\text{ cm}^2). This doubles specific membrane area (a_v: 133.33 \to 266.67\text{ m}^{-1}), providing twice the mass-transfer contact area per cubic centimeter of catalyst.</w:t>
       </w:r>
     </w:p>
     <w:p>
@@ -2896,7 +3256,7 @@
           <w:color w:val="1F2937"/>
           <w:sz w:val="20"/>
         </w:rPr>
-        <w:t>**Why Case Study A (Uniform Sleeves) Was Defective:**</w:t>
+        <w:t>**Why Uniform Catalyst Sleeves Were Defective:**</w:t>
       </w:r>
     </w:p>
     <w:p>
@@ -2908,7 +3268,7 @@
           <w:color w:val="1F2937"/>
           <w:sz w:val="20"/>
         </w:rPr>
-        <w:t>Wrapping individual tubes in catalyst sleeves touching each other in square tangent circle packing creates **.37\% unfillable void space** (central diamond void + four outer crescent voids).</w:t>
+        <w:t>Wrapping individual tubes in catalyst sleeves touching each other in square tangent circle packing creates **31.37% unfillable void space** (central diamond void + four outer crescent voids).</w:t>
       </w:r>
     </w:p>
     <w:p>
@@ -2920,7 +3280,7 @@
           <w:color w:val="1F2937"/>
           <w:sz w:val="20"/>
         </w:rPr>
-        <w:t>According to fluid mechanics, flow resistance through a packed bed is governed by the Ergun equation (high hydraulic drag, \Delta P_{\mathrm{bed}}), whereas empty voids exhibit near-zero drag (Poiseuille pipe flow, \Delta P_{\mathrm{void}} \ll \Delta P_{\mathrm{bed}}).</w:t>
+        <w:t>According to fluid mechanics, flow resistance through a packed bed is governed by the Ergun equation (high hydraulic drag, \Delta P_{\text{bed}}), whereas empty voids exhibit near-zero drag (Poiseuille pipe flow, \Delta P_{\text{void}} \ll \Delta P_{\text{bed}}).</w:t>
       </w:r>
     </w:p>
     <w:p>
@@ -2932,11 +3292,7 @@
           <w:color w:val="1F2937"/>
           <w:sz w:val="20"/>
         </w:rPr>
-        <w:t>Consequently, feed syngas preferentially channels through the empty voids, bypassing the catalyst bed entirely. Simulations demonstrated that leaving these voids unsealed drops DME yield by **569X29.66</w:t>
-        <w:tab/>
-        <w:t xml:space="preserve">ext{ percentage points}* (.39\% </w:t>
-        <w:tab/>
-        <w:t>o 62.73\%). Complete sealing with impermeable ceramic fillers is costly and prone to thermal shock cracking.</w:t>
+        <w:t>Consequently, feed syngas preferentially channels through the empty voids, bypassing the catalyst bed entirely. Simulations demonstrated that leaving these voids unsealed drops DME yield by **29.66 percentage points** (92.39\% \to 62.73\%). Complete sealing with impermeable ceramic fillers is costly and prone to thermal shock cracking.</w:t>
       </w:r>
     </w:p>
     <w:p>
@@ -2949,7 +3305,7 @@
           <w:color w:val="1F2937"/>
           <w:sz w:val="20"/>
         </w:rPr>
-        <w:t>**Why Case Study B (Shell-Packed CMR) Is Superior:**</w:t>
+        <w:t>**Why the Shell-Packed CMR Is Superior:**</w:t>
       </w:r>
     </w:p>
     <w:p>
@@ -2961,7 +3317,7 @@
           <w:color w:val="1F2937"/>
           <w:sz w:val="20"/>
         </w:rPr>
-        <w:t>Case Study B packs the **entire shell space** around the four tubes with catalyst micro-pellets. This completely eliminates void pockets, reduces bypass risk to **zsh.00\%*, utilizes \% of the shell bore for catalytic conversion, and requires zero inert sealing materials.</w:t>
+        <w:t>The Shell-Packed CMR packs the **entire shell space** around the four tubes with catalyst micro-pellets. This completely eliminates void pockets, reduces bypass risk to **0.00%**, utilizes 100% of the active shell bore for catalytic conversion, and requires zero inert sealing materials.</w:t>
       </w:r>
     </w:p>
     <w:p>
@@ -2986,7 +3342,7 @@
           <w:color w:val="1F2937"/>
           <w:sz w:val="20"/>
         </w:rPr>
-        <w:t>At ^\circ\mathrm{C} and \ \mathrm{bar}, the superficial syngas velocity is  = 0.016\ \mathrm{m/s}. The Ergun equation yields an axial pressure drop of \Delta P = 0.0337\ \mathrm{bar} over the .0\ \mathrm{m} length, which is only **zsh.08\%* of the total operating pressure. This confirms that the bed operates under uniform isobaric conditions without requiring parasitic compression power.</w:t>
+        <w:t>At 250^\circ\text{C} and 40\text{ bar}, the superficial syngas velocity is u_s = 0.016\text{ m/s}. The Ergun equation yields an axial pressure drop of \Delta P = 0.0337\text{ bar} over the 1.0\text{ m} length, which is only **0.08%** of the total operating pressure. This confirms that the bed operates under uniform isobaric conditions without requiring parasitic compression power.</w:t>
       </w:r>
     </w:p>
     <w:p>
@@ -3012,7 +3368,7 @@
           <w:color w:val="1F2937"/>
           <w:sz w:val="20"/>
         </w:rPr>
-        <w:t>**Pellet Bridging Threshold:** In chemical engineering multiphase reactors, the ratio of the wall-to-wall clearance gap (\delta) to the catalyst pellet diameter () governs packing uniformity. If \delta / d_p &lt; 5.0, mechanical bridging occurs during dry-loading. Pellets arch over the restriction, leaving large localized void spaces that cause severe velocity maldistribution and wall channeling.</w:t>
+        <w:t>**Pellet Bridging Threshold:** In chemical engineering multiphase reactors, the ratio of the wall-to-wall clearance gap (\delta) to the catalyst pellet diameter (d_p) governs packing uniformity. If \delta / d_p &lt; 5.0, mechanical bridging occurs during dry-loading. Pellets arch over the restriction, leaving large localized void spaces that cause severe velocity maldistribution and wall channeling.</w:t>
       </w:r>
     </w:p>
     <w:p>
@@ -3038,7 +3394,7 @@
           <w:color w:val="1F2937"/>
           <w:sz w:val="20"/>
         </w:rPr>
-        <w:t>Single-Tube CMR: Annular gap  5.00\ \mathrm{mm} \implies \delta / d_p = 5.00 / 0.30 = \mathbf{16.67} \gg 5.0.</w:t>
+        <w:t>Single-Tube CMR: Annular gap \delta = 5.00\text{ mm} \implies \delta / d_p = 5.00 / 0.30 = 16.67 \gg 5.0.</w:t>
       </w:r>
     </w:p>
     <w:p>
@@ -3051,7 +3407,7 @@
           <w:color w:val="1F2937"/>
           <w:sz w:val="20"/>
         </w:rPr>
-        <w:t>Four-Tube Shell-Packed CMR: The narrowest clearance is the diagonal gap between opposing tubes (\delta_{\mathrm{gap}} = 2.071\ \mathrm{mm}).</w:t>
+        <w:t>Four-Tube Shell-Packed CMR: The narrowest clearance is the diagonal gap between opposing tubes (\delta_{\text{gap}} = 2.071\text{ mm}).</w:t>
       </w:r>
     </w:p>
     <w:p>
@@ -3063,7 +3419,6 @@
           <w:color w:val="1F2937"/>
           <w:sz w:val="20"/>
         </w:rPr>
-        <w:t>9325rac{\delta_{\mathrm{gap}}}{d_p} = rac{2.071\ \mathrm{mm}}{0.30\ \mathrm{mm}} = \mathbf{6.90} \ge 5.09325</w:t>
       </w:r>
     </w:p>
     <w:p>
@@ -3075,7 +3430,30 @@
           <w:color w:val="1F2937"/>
           <w:sz w:val="20"/>
         </w:rPr>
-        <w:t>Because .90 &gt; 5.0, the Four-Tube bed complies with the Happel-Brenner stability criterion, ensuring dense, uniform random packing without bridging or bypass channels.</w:t>
+        <w:t>\frac{\delta_{\text{gap}}}{d_p} = \frac{2.071\text{ mm}}{0.30\text{ mm}} = 6.90 \ge 5.0</w:t>
+      </w:r>
+    </w:p>
+    <w:p>
+      <w:pPr>
+        <w:spacing w:before="40" w:after="80"/>
+      </w:pPr>
+      <w:r>
+        <w:rPr>
+          <w:color w:val="1F2937"/>
+          <w:sz w:val="20"/>
+        </w:rPr>
+      </w:r>
+    </w:p>
+    <w:p>
+      <w:pPr>
+        <w:spacing w:before="40" w:after="80"/>
+      </w:pPr>
+      <w:r>
+        <w:rPr>
+          <w:color w:val="1F2937"/>
+          <w:sz w:val="20"/>
+        </w:rPr>
+        <w:t>Because 6.90 \ge 5.0, the Four-Tube bed complies with the Happel-Brenner stability criterion, ensuring dense, uniform random packing without bridging or bypass channels.</w:t>
       </w:r>
     </w:p>
     <w:p>
@@ -3100,11 +3478,7 @@
           <w:color w:val="1F2937"/>
           <w:sz w:val="20"/>
         </w:rPr>
-        <w:t>In chemical reaction engineering, comparing reactors with differing catalyst inventory ({\mathrm{cat}}), differing active volumes ({\mathrm{bed}}), or differing space velocities (</w:t>
-        <w:tab/>
-        <w:t>ext{GHSV}) convolutes residence time variations (</w:t>
-        <w:tab/>
-        <w:t>au = W_{\mathrm{cat}} / F_{\mathrm{feed}}) with architectural intensification.</w:t>
+        <w:t>In chemical reaction engineering, comparing reactors with differing catalyst inventory (W_{\text{cat}}), differing active volumes (V_{\text{bed}}), or differing space velocities (\text{GHSV}) convolutes residence time variations (\tau = W_{\text{cat}} / F_{\text{feed}}) with architectural intensification.</w:t>
       </w:r>
     </w:p>
     <w:p>
@@ -3129,7 +3503,7 @@
           <w:color w:val="1F2937"/>
           <w:sz w:val="20"/>
         </w:rPr>
-        <w:t>**Shell Outer Diameter is Constant:** {\mathrm{shell}} = 20.00\ \mathrm{mm} ({\mathrm{shell}} = 10.00\ \mathrm{mm}).</w:t>
+        <w:t>**Shell Outer Diameter is Constant:** D_{\text{shell}} = 20.00\text{ mm} (R_{\text{shell}} = 10.00\text{ mm}).</w:t>
       </w:r>
     </w:p>
     <w:p>
@@ -3142,7 +3516,7 @@
           <w:color w:val="1F2937"/>
           <w:sz w:val="20"/>
         </w:rPr>
-        <w:t>**Reactor Length is Constant:**  = 1000.0\ \mathrm{mm} (.00\ \mathrm{m}).</w:t>
+        <w:t>**Reactor Length is Constant:** L = 1000.0\text{ mm} (1.00\text{ m}).</w:t>
       </w:r>
     </w:p>
     <w:p>
@@ -3155,9 +3529,7 @@
           <w:color w:val="1F2937"/>
           <w:sz w:val="20"/>
         </w:rPr>
-        <w:t xml:space="preserve">**Active Bed Cross-Section is Constant:**  = 2.3562\ \mathrm{cm}^2 (.0\% of shell bore) for both Single-Tube (^2 - 10^2) and Four-Tube (^2 - 4 </w:t>
-        <w:tab/>
-        <w:t>imes 5^2).</w:t>
+        <w:t>**Active Bed Cross-Section is Constant:** A_c = 2.3562\text{ cm}^2 (75.0\% of shell bore) for both Single-Tube (20^2 - 10^2) and Four-Tube (20^2 - 4 \times 5^2).</w:t>
       </w:r>
     </w:p>
     <w:p>
@@ -3170,7 +3542,7 @@
           <w:color w:val="1F2937"/>
           <w:sz w:val="20"/>
         </w:rPr>
-        <w:t>**Catalyst Mass is Constant:** {\mathrm{cat}} = 0.2827\ \mathrm{kg} (.74\ \mathrm{g}).</w:t>
+        <w:t>**Catalyst Mass is Constant:** W_{\text{cat}} = 0.2827\text{ kg} (282.74\text{ g}).</w:t>
       </w:r>
     </w:p>
     <w:p>
@@ -3183,9 +3555,7 @@
           <w:color w:val="1F2937"/>
           <w:sz w:val="20"/>
         </w:rPr>
-        <w:t xml:space="preserve">**Feed Throughput is Constant:** {\mathrm{feed}} = 2.9200\ \mathrm{mmol/s} (.9270\ \mathrm{NL/min}) at </w:t>
-        <w:tab/>
-        <w:t>ext{GHSV} = 1000\ \mathrm{h}^{-1}.</w:t>
+        <w:t>**Feed Throughput is Constant:** F_{\text{feed}} = 2.9200\text{ mmol/s} (3.9270\text{ NL/min}) at \text{GHSV} = 1000\text{ h}^{-1}.</w:t>
       </w:r>
     </w:p>
     <w:p>
@@ -3197,11 +3567,7 @@
           <w:color w:val="1F2937"/>
           <w:sz w:val="20"/>
         </w:rPr>
-        <w:t>Because all macro-scale dimensions, catalyst mass, and feed rates are identical, the observed **0.53</w:t>
-        <w:tab/>
-        <w:t xml:space="preserve">ext{ percentage point}* increase in DME yield (.63\% </w:t>
-        <w:tab/>
-        <w:t>o 86.16\%) is proven to originate **\% from transport intensification** (halved diffusion distance \Delta r and doubled specific membrane area ).</w:t>
+        <w:t>Because all macro-scale dimensions, catalyst mass, and feed rates are identical, the observed **8.53 percentage point** increase in DME yield (77.63\% \to 86.16\%) is proven to originate **100% from transport intensification** (halved diffusion distance \Delta r and doubled specific membrane area a_v).</w:t>
       </w:r>
     </w:p>
     <w:p>
@@ -3735,7 +4101,7 @@
                 <w:color w:val="1F2937"/>
                 <w:sz w:val="18"/>
               </w:rPr>
-              <w:t>Validated for species partial pressure ratios up to 40\text{ bar} at 523.15\text{ K}; compressibility factor Z \approx 0.95\text{--}0.98.</w:t>
+              <w:t>Validated for species partial pressure ratios up to 40\text{ bar} at 523.15\text{ K}; compressibility factor Z \approx 0.95\text{ to }0.98.</w:t>
             </w:r>
           </w:p>
         </w:tc>
@@ -4034,7 +4400,7 @@
                 <w:color w:val="1F2937"/>
                 <w:sz w:val="18"/>
               </w:rPr>
-              <w:t>\frac{r{\text{gen},\text{H}2\text{O}}}{J{\text{perm},\text{H}2\text{O}} \cdot av}</w:t>
+              <w:t>r{\text{gen},\text{H}2\text{O}} / (J{\text{perm},\text{H}2\text{O}} \cdot av)</w:t>
             </w:r>
           </w:p>
         </w:tc>
@@ -4057,7 +4423,7 @@
                 <w:color w:val="1F2937"/>
                 <w:sz w:val="18"/>
               </w:rPr>
-              <w:t>0.98\text{--}1.05</w:t>
+              <w:t>0.98 – 1.05</w:t>
             </w:r>
           </w:p>
         </w:tc>
@@ -4125,7 +4491,7 @@
                 <w:color w:val="1F2937"/>
                 <w:sz w:val="18"/>
               </w:rPr>
-              <w:t>\frac{us L}{D{\text{ax}}}</w:t>
+              <w:t>us L / D{\text{ax}}</w:t>
             </w:r>
           </w:p>
         </w:tc>
@@ -4216,7 +4582,7 @@
                 <w:color w:val="1F2937"/>
                 <w:sz w:val="18"/>
               </w:rPr>
-              <w:t>\frac{\rhog us dp}{\mug (1 - \varepsilonb)}</w:t>
+              <w:t>\rhog us dp / [\mug (1 - \varepsilonb)]</w:t>
             </w:r>
           </w:p>
         </w:tc>
@@ -4307,7 +4673,7 @@
                 <w:color w:val="1F2937"/>
                 <w:sz w:val="18"/>
               </w:rPr>
-              <w:t>\frac{\rho{\text{sw}} u{\text{sw}} d{\text{in}}}{\mu{\text{sw}}}</w:t>
+              <w:t>\rho{\text{sw}} u{\text{sw}} d{\text{in}} / \mu{\text{sw}}</w:t>
             </w:r>
           </w:p>
         </w:tc>
@@ -4330,7 +4696,7 @@
                 <w:color w:val="1F2937"/>
                 <w:sz w:val="18"/>
               </w:rPr>
-              <w:t>284 (4-Tube)</w:t>
+              <w:t>284</w:t>
             </w:r>
           </w:p>
         </w:tc>
@@ -4398,7 +4764,7 @@
                 <w:color w:val="1F2937"/>
                 <w:sz w:val="18"/>
               </w:rPr>
-              <w:t>\frac{\text{Inter-tube Clearance}}{\text{Pellet Diameter}}</w:t>
+              <w:t>Inter-tube Clearance / Pellet Diameter</w:t>
             </w:r>
           </w:p>
         </w:tc>
@@ -4421,7 +4787,7 @@
                 <w:color w:val="1F2937"/>
                 <w:sz w:val="18"/>
               </w:rPr>
-              <w:t>6.90 \ge 5.0</w:t>
+              <w:t>6.90 ≥ 5.0</w:t>
             </w:r>
           </w:p>
         </w:tc>
@@ -4489,7 +4855,7 @@
                 <w:color w:val="1F2937"/>
                 <w:sz w:val="18"/>
               </w:rPr>
-              <w:t>\frac{r{\text{obs}} \rhop (dp/6)^2}{D{\text{eff}} C{s}}</w:t>
+              <w:t>r{\text{obs}} \rhop (dp/6)^2 / (D{\text{eff}} C{s})</w:t>
             </w:r>
           </w:p>
         </w:tc>
@@ -4580,7 +4946,7 @@
                 <w:color w:val="1F2937"/>
                 <w:sz w:val="18"/>
               </w:rPr>
-              <w:t>\frac{r{\text{obs}} \rhob (dp/2)}{kc Cb}</w:t>
+              <w:t>r{\text{obs}} \rhob (dp/2) / (kc Cb)</w:t>
             </w:r>
           </w:p>
         </w:tc>
@@ -4603,7 +4969,7 @@
                 <w:color w:val="1F2937"/>
                 <w:sz w:val="18"/>
               </w:rPr>
-              <w:t>0.02 \ll 0.15</w:t>
+              <w:t>0.02 ≪ 0.15</w:t>
             </w:r>
           </w:p>
         </w:tc>
@@ -4674,11 +5040,11 @@
         <w:br/>
         <w:t>========================================================================================</w:t>
         <w:br/>
-        <w:t xml:space="preserve">  Shell Inner Diameter (D_shell)     :  20.00 mm  (R_shell = 10.00 mm)</w:t>
+        <w:t xml:space="preserve">  Reactor Shell Inner Diameter (D_shell):  20.00 mm (0.020 m)</w:t>
         <w:br/>
-        <w:t xml:space="preserve">  Reactor Active Length (L)          :   1.00 m   (1000.0 mm)</w:t>
+        <w:t xml:space="preserve">  Reactor Active Bed Length (L)         : 1000.0 mm (1.000 m)</w:t>
         <w:br/>
-        <w:t xml:space="preserve">  Catalyst Bed Cross-Section (Ac)    :   2.3562 cm^2 (75.00% of shell bore)</w:t>
+        <w:t xml:space="preserve">  Catalyst Bed Cross-Section (A_c)      :   2.3562 cm^2 (235.62 mm^2)</w:t>
         <w:br/>
         <w:t xml:space="preserve">  Catalyst Bed Volume (V_bed)        : 235.62 cm^3 (0.2356 L)</w:t>
         <w:br/>
@@ -4708,13 +5074,22 @@
     </w:p>
     <w:p>
       <w:pPr>
-        <w:spacing w:before="80" w:after="80"/>
-        <w:jc w:val="center"/>
+        <w:spacing w:before="40" w:after="80"/>
       </w:pPr>
       <w:r>
         <w:rPr>
-          <w:i/>
-          <w:color w:val="475569"/>
+          <w:color w:val="1F2937"/>
+          <w:sz w:val="20"/>
+        </w:rPr>
+      </w:r>
+    </w:p>
+    <w:p>
+      <w:pPr>
+        <w:spacing w:before="40" w:after="80"/>
+      </w:pPr>
+      <w:r>
+        <w:rPr>
+          <w:color w:val="1F2937"/>
           <w:sz w:val="20"/>
         </w:rPr>
         <w:t>A_c = \frac{\pi}{4} D_{\text{shell}}^2 - N_t \left( \frac{\pi}{4} d_t^2 \right)</w:t>
@@ -4722,15 +5097,13 @@
     </w:p>
     <w:p>
       <w:pPr>
-        <w:pStyle w:val="ListBullet"/>
-        <w:spacing w:before="20" w:after="40"/>
+        <w:spacing w:before="40" w:after="80"/>
       </w:pPr>
       <w:r>
         <w:rPr>
           <w:color w:val="1F2937"/>
           <w:sz w:val="20"/>
         </w:rPr>
-        <w:t>**Single-Tube CMR:** A_{c,1} = \frac{\pi}{4}(20.00^2 - 1 \times 10.00^2) \times 10^{-6} = \frac{300 \pi}{4} \times 10^{-6} = \mathbf{2.3562\text{ cm}^2}</w:t>
       </w:r>
     </w:p>
     <w:p>
@@ -4743,7 +5116,20 @@
           <w:color w:val="1F2937"/>
           <w:sz w:val="20"/>
         </w:rPr>
-        <w:t>**Four-Tube Shell-Packed CMR:** A_{c,4} = \frac{\pi}{4}(20.00^2 - 4 \times 5.00^2) \times 10^{-6} = \frac{300 \pi}{4} \times 10^{-6} = \mathbf{2.3562\text{ cm}^2}</w:t>
+        <w:t>**Single-Tube CMR:** A_{c,1} = \frac{\pi}{4}(20.00^2 - 1 \times 10.00^2) \times 10^{-6} = \frac{300 \pi}{4} \times 10^{-6} = 2.3562\text{ cm}^2</w:t>
+      </w:r>
+    </w:p>
+    <w:p>
+      <w:pPr>
+        <w:pStyle w:val="ListBullet"/>
+        <w:spacing w:before="20" w:after="40"/>
+      </w:pPr>
+      <w:r>
+        <w:rPr>
+          <w:color w:val="1F2937"/>
+          <w:sz w:val="20"/>
+        </w:rPr>
+        <w:t>**Four-Tube Shell-Packed CMR:** A_{c,4} = \frac{\pi}{4}(20.00^2 - 4 \times 5.00^2) \times 10^{-6} = \frac{300 \pi}{4} \times 10^{-6} = 2.3562\text{ cm}^2</w:t>
       </w:r>
     </w:p>
     <w:p>
@@ -5034,7 +5420,7 @@
                 <w:color w:val="1F2937"/>
                 <w:sz w:val="18"/>
               </w:rPr>
-              <w:t>20.00\text{ mm} (0.020\text{ m})</w:t>
+              <w:t>20.00 mm (0.020\text{ m})</w:t>
             </w:r>
           </w:p>
         </w:tc>
@@ -5057,7 +5443,7 @@
                 <w:color w:val="1F2937"/>
                 <w:sz w:val="18"/>
               </w:rPr>
-              <w:t>20.00\text{ mm} (0.020\text{ m})</w:t>
+              <w:t>20.00 mm (0.020\text{ m})</w:t>
             </w:r>
           </w:p>
         </w:tc>
@@ -5125,7 +5511,7 @@
                 <w:color w:val="1F2937"/>
                 <w:sz w:val="18"/>
               </w:rPr>
-              <w:t>1000.0\text{ mm} (1.00\text{ m})</w:t>
+              <w:t>1000.0 mm (1.00\text{ m})</w:t>
             </w:r>
           </w:p>
         </w:tc>
@@ -5148,7 +5534,7 @@
                 <w:color w:val="1F2937"/>
                 <w:sz w:val="18"/>
               </w:rPr>
-              <w:t>1000.0\text{ mm} (1.00\text{ m})</w:t>
+              <w:t>1000.0 mm (1.00\text{ m})</w:t>
             </w:r>
           </w:p>
         </w:tc>
@@ -5216,7 +5602,7 @@
                 <w:color w:val="1F2937"/>
                 <w:sz w:val="18"/>
               </w:rPr>
-              <w:t>2.3562\text{ cm}^2</w:t>
+              <w:t>2.3562 cm²</w:t>
             </w:r>
           </w:p>
         </w:tc>
@@ -5239,7 +5625,7 @@
                 <w:color w:val="1F2937"/>
                 <w:sz w:val="18"/>
               </w:rPr>
-              <w:t>2.3562\text{ cm}^2</w:t>
+              <w:t>2.3562 cm²</w:t>
             </w:r>
           </w:p>
         </w:tc>
@@ -5307,7 +5693,7 @@
                 <w:color w:val="1F2937"/>
                 <w:sz w:val="18"/>
               </w:rPr>
-              <w:t>0.2827\text{ kg} (282.74\text{ g})</w:t>
+              <w:t>0.2827 kg (282.74\text{ g})</w:t>
             </w:r>
           </w:p>
         </w:tc>
@@ -5330,7 +5716,7 @@
                 <w:color w:val="1F2937"/>
                 <w:sz w:val="18"/>
               </w:rPr>
-              <w:t>0.2827\text{ kg} (282.74\text{ g})</w:t>
+              <w:t>0.2827 kg (282.74\text{ g})</w:t>
             </w:r>
           </w:p>
         </w:tc>
@@ -5489,7 +5875,7 @@
                 <w:color w:val="1F2937"/>
                 <w:sz w:val="18"/>
               </w:rPr>
-              <w:t>10.00\text{ mm} (rt = 5.0\text{ mm})</w:t>
+              <w:t>10.00 mm (rt = 5.0\text{ mm})</w:t>
             </w:r>
           </w:p>
         </w:tc>
@@ -5512,7 +5898,7 @@
                 <w:color w:val="1F2937"/>
                 <w:sz w:val="18"/>
               </w:rPr>
-              <w:t>5.00\text{ mm} (rt = 2.5\text{ mm})</w:t>
+              <w:t>5.00 mm (rt = 2.5\text{ mm})</w:t>
             </w:r>
           </w:p>
         </w:tc>
@@ -5580,7 +5966,7 @@
                 <w:color w:val="1F2937"/>
                 <w:sz w:val="18"/>
               </w:rPr>
-              <w:t>1.00\text{ mm} (ceramic support)</w:t>
+              <w:t>1.00 mm (ceramic support)</w:t>
             </w:r>
           </w:p>
         </w:tc>
@@ -5603,7 +5989,7 @@
                 <w:color w:val="1F2937"/>
                 <w:sz w:val="18"/>
               </w:rPr>
-              <w:t>0.80\text{ mm} (ceramic support)</w:t>
+              <w:t>0.80 mm (ceramic support)</w:t>
             </w:r>
           </w:p>
         </w:tc>
@@ -5671,7 +6057,7 @@
                 <w:color w:val="1F2937"/>
                 <w:sz w:val="18"/>
               </w:rPr>
-              <w:t>8.00\text{ mm}</w:t>
+              <w:t>8.00 mm</w:t>
             </w:r>
           </w:p>
         </w:tc>
@@ -5694,7 +6080,7 @@
                 <w:color w:val="1F2937"/>
                 <w:sz w:val="18"/>
               </w:rPr>
-              <w:t>3.40\text{ mm}</w:t>
+              <w:t>3.40 mm</w:t>
             </w:r>
           </w:p>
         </w:tc>
@@ -5762,7 +6148,7 @@
                 <w:color w:val="1F2937"/>
                 <w:sz w:val="18"/>
               </w:rPr>
-              <w:t>0.00\text{ mm} (centerline)</w:t>
+              <w:t>0.00 mm (centerline)</w:t>
             </w:r>
           </w:p>
         </w:tc>
@@ -5785,7 +6171,7 @@
                 <w:color w:val="1F2937"/>
                 <w:sz w:val="18"/>
               </w:rPr>
-              <w:t>5.00\text{ mm} (R{\text{shell}} / 2)</w:t>
+              <w:t>5.00 mm (R{\text{shell}} / 2)</w:t>
             </w:r>
           </w:p>
         </w:tc>
@@ -5944,7 +6330,7 @@
                 <w:color w:val="1F2937"/>
                 <w:sz w:val="18"/>
               </w:rPr>
-              <w:t>31.42\text{ mm} (0.0314\text{ m})</w:t>
+              <w:t>31.42 mm (0.0314\text{ m})</w:t>
             </w:r>
           </w:p>
         </w:tc>
@@ -5967,7 +6353,7 @@
                 <w:color w:val="1F2937"/>
                 <w:sz w:val="18"/>
               </w:rPr>
-              <w:t>62.83\text{ mm} (0.0628\text{ m})</w:t>
+              <w:t>62.83 mm (0.0628\text{ m})</w:t>
             </w:r>
           </w:p>
         </w:tc>
@@ -5990,7 +6376,7 @@
                 <w:color w:val="1F2937"/>
                 <w:sz w:val="18"/>
               </w:rPr>
-              <w:t>2.0\times increase</w:t>
+              <w:t>2.0× increase</w:t>
             </w:r>
           </w:p>
         </w:tc>
@@ -6035,7 +6421,7 @@
                 <w:color w:val="1F2937"/>
                 <w:sz w:val="18"/>
               </w:rPr>
-              <w:t>133.33\text{ m}^{-1}</w:t>
+              <w:t>133.33 m⁻¹</w:t>
             </w:r>
           </w:p>
         </w:tc>
@@ -6058,7 +6444,7 @@
                 <w:color w:val="1F2937"/>
                 <w:sz w:val="18"/>
               </w:rPr>
-              <w:t>266.67\text{ m}^{-1}</w:t>
+              <w:t>266.67 m⁻¹</w:t>
             </w:r>
           </w:p>
         </w:tc>
@@ -6081,7 +6467,7 @@
                 <w:color w:val="1F2937"/>
                 <w:sz w:val="18"/>
               </w:rPr>
-              <w:t>2.0\times intensification</w:t>
+              <w:t>2.0× intensification</w:t>
             </w:r>
           </w:p>
         </w:tc>
@@ -6126,7 +6512,7 @@
                 <w:color w:val="1F2937"/>
                 <w:sz w:val="18"/>
               </w:rPr>
-              <w:t>0.0314\text{ m}^2 (314.16\text{ cm}^2)</w:t>
+              <w:t>0.0314 m² (314.16\text{ cm}^2)</w:t>
             </w:r>
           </w:p>
         </w:tc>
@@ -6149,7 +6535,7 @@
                 <w:color w:val="1F2937"/>
                 <w:sz w:val="18"/>
               </w:rPr>
-              <w:t>0.0628\text{ m}^2 (628.32\text{ cm}^2)</w:t>
+              <w:t>0.0628 m² (628.32\text{ cm}^2)</w:t>
             </w:r>
           </w:p>
         </w:tc>
@@ -6172,7 +6558,7 @@
                 <w:color w:val="1F2937"/>
                 <w:sz w:val="18"/>
               </w:rPr>
-              <w:t>2.0\times increase</w:t>
+              <w:t>2.0× increase</w:t>
             </w:r>
           </w:p>
         </w:tc>
@@ -6217,7 +6603,7 @@
                 <w:color w:val="1F2937"/>
                 <w:sz w:val="18"/>
               </w:rPr>
-              <w:t>5.00\text{ mm}</w:t>
+              <w:t>5.00 mm</w:t>
             </w:r>
           </w:p>
         </w:tc>
@@ -6240,7 +6626,7 @@
                 <w:color w:val="1F2937"/>
                 <w:sz w:val="18"/>
               </w:rPr>
-              <w:t>2.50\text{ mm}</w:t>
+              <w:t>2.50 mm</w:t>
             </w:r>
           </w:p>
         </w:tc>
@@ -6331,7 +6717,7 @@
                 <w:color w:val="1F2937"/>
                 <w:sz w:val="18"/>
               </w:rPr>
-              <w:t>2.50\text{ mm}</w:t>
+              <w:t>2.50 mm</w:t>
             </w:r>
           </w:p>
         </w:tc>
@@ -6422,7 +6808,7 @@
                 <w:color w:val="1F2937"/>
                 <w:sz w:val="18"/>
               </w:rPr>
-              <w:t>2.071\text{ mm}</w:t>
+              <w:t>2.071 mm</w:t>
             </w:r>
           </w:p>
         </w:tc>
@@ -6581,7 +6967,7 @@
                 <w:color w:val="1F2937"/>
                 <w:sz w:val="18"/>
               </w:rPr>
-              <w:t>5.00\text{ mm}</w:t>
+              <w:t>5.00 mm</w:t>
             </w:r>
           </w:p>
         </w:tc>
@@ -6604,7 +6990,7 @@
                 <w:color w:val="1F2937"/>
                 <w:sz w:val="18"/>
               </w:rPr>
-              <w:t>2.50\text{ mm}</w:t>
+              <w:t>2.50 mm</w:t>
             </w:r>
           </w:p>
         </w:tc>
@@ -6627,7 +7013,7 @@
                 <w:color w:val="1F2937"/>
                 <w:sz w:val="18"/>
               </w:rPr>
-              <w:t>50.0\% reduction in diffusion path</w:t>
+              <w:t>50.0% reduction in diffusion path</w:t>
             </w:r>
           </w:p>
         </w:tc>
@@ -6672,7 +7058,7 @@
                 <w:color w:val="1F2937"/>
                 <w:sz w:val="18"/>
               </w:rPr>
-              <w:t>0.0\%</w:t>
+              <w:t>0.0%</w:t>
             </w:r>
           </w:p>
         </w:tc>
@@ -6695,7 +7081,7 @@
                 <w:color w:val="1F2937"/>
                 <w:sz w:val="18"/>
               </w:rPr>
-              <w:t>0.0\%</w:t>
+              <w:t>0.0%</w:t>
             </w:r>
           </w:p>
         </w:tc>
@@ -6748,7 +7134,7 @@
           <w:color w:val="475569"/>
           <w:sz w:val="24"/>
         </w:rPr>
-        <w:t xml:space="preserve"> 10.1 Standard Baseline Operating Conditions</w:t>
+        <w:t xml:space="preserve"> 11.1 Standard Baseline Operating Conditions</w:t>
       </w:r>
     </w:p>
     <w:p>
@@ -6774,7 +7160,7 @@
           <w:color w:val="1F2937"/>
           <w:sz w:val="20"/>
         </w:rPr>
-        <w:t>**Retentate Feed Pressure:** P_{\text{ret}} = 40.0\text{ bar} (4.0\text{ MPa})</w:t>
+        <w:t>**Reaction Pressure:** P_{\text{ret}} = 40.0\text{ bar} (4.0\text{ MPa})</w:t>
       </w:r>
     </w:p>
     <w:p>
@@ -6787,7 +7173,7 @@
           <w:color w:val="1F2937"/>
           <w:sz w:val="20"/>
         </w:rPr>
-        <w:t>**Permeate Sweep Pressure:** P_{\text{perm}} = 1.0\text{ bar} (0.10\text{ MPa})</w:t>
+        <w:t>**Permeate Sweep Pressure:** P_{\text{perm}} = 1.0\text{ bar} (0.1\text{ MPa})</w:t>
       </w:r>
     </w:p>
     <w:p>
@@ -6800,7 +7186,7 @@
           <w:color w:val="1F2937"/>
           <w:sz w:val="20"/>
         </w:rPr>
-        <w:t>**Feed Syngas Ratio:** \text{H}_2 / \text{CO}_2 = 3.0 (25.0\%\text{ CO}_2, 75.0\%\text{ H}_2)</w:t>
+        <w:t>**Feed Molar Ratio:** \text{H}_2 / \text{CO}_2 = 3.0 (75.0\%\text{ H}_2, 25.0\%\text{ CO}_2)</w:t>
       </w:r>
     </w:p>
     <w:p>
@@ -6813,7 +7199,7 @@
           <w:color w:val="1F2937"/>
           <w:sz w:val="20"/>
         </w:rPr>
-        <w:t>**Space Velocity:** \text{GHSV} = 1000\text{ h}^{-1}\text{ STP}</w:t>
+        <w:t>**Gas Hourly Space Velocity:** \text{GHSV} = 1000\text{ h}^{-1} (STP bed volume basis)</w:t>
       </w:r>
     </w:p>
     <w:p>
@@ -6826,7 +7212,20 @@
           <w:color w:val="1F2937"/>
           <w:sz w:val="20"/>
         </w:rPr>
-        <w:t>**Sweep Gas:** Dry \text{N}_2 (co-current flow), sweep ratio baseline \theta = 1.00</w:t>
+        <w:t>**Sweep-to-Feed Molar Ratio:** \theta = F_{\text{sweep}} / F_{\text{feed}} = 1.00</w:t>
+      </w:r>
+    </w:p>
+    <w:p>
+      <w:pPr>
+        <w:pStyle w:val="ListBullet"/>
+        <w:spacing w:before="20" w:after="40"/>
+      </w:pPr>
+      <w:r>
+        <w:rPr>
+          <w:color w:val="1F2937"/>
+          <w:sz w:val="20"/>
+        </w:rPr>
+        <w:t>**Sweep Gas:** Pure Argon (\text{Ar}) or Nitrogen (\text{N}_2)</w:t>
       </w:r>
     </w:p>
     <w:p>
@@ -6839,35 +7238,93 @@
           <w:color w:val="475569"/>
           <w:sz w:val="24"/>
         </w:rPr>
-        <w:t xml:space="preserve"> 10.2 Absolute Flow Rates Across Units</w:t>
+        <w:t xml:space="preserve"> 11.2 Absolute Flow Rates Across Units</w:t>
       </w:r>
     </w:p>
     <w:p>
       <w:pPr>
-        <w:spacing w:before="80" w:after="80"/>
-        <w:jc w:val="center"/>
+        <w:spacing w:before="40" w:after="80"/>
       </w:pPr>
       <w:r>
         <w:rPr>
-          <w:i/>
-          <w:color w:val="475569"/>
+          <w:color w:val="1F2937"/>
           <w:sz w:val="20"/>
         </w:rPr>
-        <w:t>\text{Feed Flow Rate: } F_{\text{feed}} = \frac{V_{\text{bed}} \cdot \text{GHSV}}{3600 \cdot 0.022414} = \mathbf{2.9200\text{ mmol/s}} = \mathbf{10.512\text{ mol/h}} \quad (3.9270\text{ NL/min})</w:t>
       </w:r>
     </w:p>
     <w:p>
       <w:pPr>
-        <w:spacing w:before="80" w:after="80"/>
-        <w:jc w:val="center"/>
+        <w:spacing w:before="40" w:after="80"/>
       </w:pPr>
       <w:r>
         <w:rPr>
-          <w:i/>
-          <w:color w:val="475569"/>
+          <w:color w:val="1F2937"/>
           <w:sz w:val="20"/>
         </w:rPr>
-        <w:t>\text{Total Sweep Rate: } F_{\text{sweep}} = 1.00 \times F_{\text{feed}} = \mathbf{2.9200\text{ mmol/s}} \quad (3.9270\text{ NL/min STP}, 7.6208\text{ L/min at } 250^\circ\text{C}, 1\text{ bar})</w:t>
+        <w:t>\text{Feed Flow Rate: } F_{\text{feed}} = \frac{V_{\text{bed}} \cdot \text{GHSV}}{3600 \cdot 0.022414} = 2.9200 \times 10^{-3}\text{ mol/s} \quad (3.9270\text{ NL/min})</w:t>
+      </w:r>
+    </w:p>
+    <w:p>
+      <w:pPr>
+        <w:spacing w:before="40" w:after="80"/>
+      </w:pPr>
+      <w:r>
+        <w:rPr>
+          <w:color w:val="1F2937"/>
+          <w:sz w:val="20"/>
+        </w:rPr>
+      </w:r>
+    </w:p>
+    <w:p>
+      <w:pPr>
+        <w:pStyle w:val="ListBullet"/>
+        <w:spacing w:before="20" w:after="40"/>
+      </w:pPr>
+      <w:r>
+        <w:rPr>
+          <w:color w:val="1F2937"/>
+          <w:sz w:val="20"/>
+        </w:rPr>
+        <w:t>**Inlet CO2 Molar Flow:** F_{\text{CO}_2,0} = 0.7300\text{ mmol/s} (0.9818\text{ NL/min})</w:t>
+      </w:r>
+    </w:p>
+    <w:p>
+      <w:pPr>
+        <w:pStyle w:val="ListBullet"/>
+        <w:spacing w:before="20" w:after="40"/>
+      </w:pPr>
+      <w:r>
+        <w:rPr>
+          <w:color w:val="1F2937"/>
+          <w:sz w:val="20"/>
+        </w:rPr>
+        <w:t>**Inlet H2 Molar Flow:** F_{\\text{H}_2,0} = 2.1900\text{ mmol/s} (2.9453\text{ NL/min})</w:t>
+      </w:r>
+    </w:p>
+    <w:p>
+      <w:pPr>
+        <w:pStyle w:val="ListBullet"/>
+        <w:spacing w:before="20" w:after="40"/>
+      </w:pPr>
+      <w:r>
+        <w:rPr>
+          <w:color w:val="1F2937"/>
+          <w:sz w:val="20"/>
+        </w:rPr>
+        <w:t>**Sweep Flow Rate:** F_{\text{sweep}} = 2.9200\text{ mmol/s} (3.9270\text{ NL/min})</w:t>
+      </w:r>
+    </w:p>
+    <w:p>
+      <w:pPr>
+        <w:pStyle w:val="ListBullet"/>
+        <w:spacing w:before="20" w:after="40"/>
+      </w:pPr>
+      <w:r>
+        <w:rPr>
+          <w:color w:val="1F2937"/>
+          <w:sz w:val="20"/>
+        </w:rPr>
+        <w:t>**Superficial Bed Velocity:** u_s = 0.0160\text{ m/s} (1.60\text{ cm/s})</w:t>
       </w:r>
     </w:p>
     <w:p>
@@ -6880,7 +7337,7 @@
           <w:color w:val="475569"/>
           <w:sz w:val="24"/>
         </w:rPr>
-        <w:t xml:space="preserve"> 10.3 Sweep Fluid Dynamics in Tubular Lumens</w:t>
+        <w:t xml:space="preserve"> 11.3 Sweep Fluid Dynamics in Tubular Lumens</w:t>
       </w:r>
     </w:p>
     <w:p>
@@ -6893,7 +7350,7 @@
           <w:color w:val="1F2937"/>
           <w:sz w:val="20"/>
         </w:rPr>
-        <w:t>**Single-Tube CMR (1 lumen, d_{\text{in}} = 8.0\text{ mm}):**</w:t>
+        <w:t>**Single-Tube CMR (Lumen d_{\text{in}} = 8.00\text{ mm}):**</w:t>
       </w:r>
     </w:p>
     <w:p>
@@ -6906,7 +7363,7 @@
           <w:color w:val="1F2937"/>
           <w:sz w:val="20"/>
         </w:rPr>
-        <w:t>Flow rate: 2.9200\text{ mmol/s} (100\%)</w:t>
+        <w:t>Cross-section: A_{\text{lumen}} = 0.5027\text{ cm}^2</w:t>
       </w:r>
     </w:p>
     <w:p>
@@ -6919,7 +7376,7 @@
           <w:color w:val="1F2937"/>
           <w:sz w:val="20"/>
         </w:rPr>
-        <w:t>Velocity: u_{\text{sw}} = 2.527\text{ m/s}, Re = 482 (Laminar)</w:t>
+        <w:t>Velocity: u_{\text{sw}} = 2.520\text{ m/s}, Re = 399 (Deep laminar)</w:t>
       </w:r>
     </w:p>
     <w:p>
@@ -6932,7 +7389,7 @@
           <w:color w:val="1F2937"/>
           <w:sz w:val="20"/>
         </w:rPr>
-        <w:t>Pressure drop: \Delta P = 34\text{ Pa} (0.00034\text{ bar})</w:t>
+        <w:t>Pressure drop: \Delta P = 27.8\text{ Pa} (0.00028\text{ bar}, &lt; 0.03\% of 1\text{ bar})</w:t>
       </w:r>
     </w:p>
     <w:p>
@@ -6945,7 +7402,7 @@
           <w:color w:val="1F2937"/>
           <w:sz w:val="20"/>
         </w:rPr>
-        <w:t>**Four-Tube Shell-Packed CMR (4 lumens, d_{\text{in}} = 3.4\text{ mm}):**</w:t>
+        <w:t>**Four-Tube CMR (4 Lumens each d_{\text{in}} = 3.40\text{ mm}):**</w:t>
       </w:r>
     </w:p>
     <w:p>
@@ -6958,7 +7415,7 @@
           <w:color w:val="1F2937"/>
           <w:sz w:val="20"/>
         </w:rPr>
-        <w:t>Flow rate per tube: 0.7300\text{ mmol/s} (25\% each, 0.9817\text{ NL/min})</w:t>
+        <w:t>Total cross-section: 4 \times 0.0908 = 0.3632\text{ cm}^2</w:t>
       </w:r>
     </w:p>
     <w:p>
@@ -7220,7 +7677,7 @@
                 <w:color w:val="475569"/>
                 <w:sz w:val="19"/>
               </w:rPr>
-              <w:t>\text{CO}2 Conversion (X{\text{CO}2})</w:t>
+              <w:t>CO2 Conversion (X{\text{CO}2})</w:t>
             </w:r>
           </w:p>
         </w:tc>
@@ -7365,7 +7822,7 @@
                 <w:color w:val="1F2937"/>
                 <w:sz w:val="18"/>
               </w:rPr>
-              <w:t>0.00\text{ m}^{-1}</w:t>
+              <w:t>0.00 m⁻¹</w:t>
             </w:r>
           </w:p>
         </w:tc>
@@ -7388,7 +7845,7 @@
                 <w:color w:val="1F2937"/>
                 <w:sz w:val="18"/>
               </w:rPr>
-              <w:t>28.99\%</w:t>
+              <w:t>28.99%</w:t>
             </w:r>
           </w:p>
         </w:tc>
@@ -7411,7 +7868,7 @@
                 <w:color w:val="1F2937"/>
                 <w:sz w:val="18"/>
               </w:rPr>
-              <w:t>19.65\%</w:t>
+              <w:t>19.65%</w:t>
             </w:r>
           </w:p>
         </w:tc>
@@ -7434,7 +7891,7 @@
                 <w:color w:val="1F2937"/>
                 <w:sz w:val="18"/>
               </w:rPr>
-              <w:t>67.78\%</w:t>
+              <w:t>67.78%</w:t>
             </w:r>
           </w:p>
         </w:tc>
@@ -7457,7 +7914,7 @@
                 <w:color w:val="1F2937"/>
                 <w:sz w:val="18"/>
               </w:rPr>
-              <w:t>0.00\%</w:t>
+              <w:t>0.00%</w:t>
             </w:r>
           </w:p>
         </w:tc>
@@ -7480,7 +7937,7 @@
                 <w:color w:val="1F2937"/>
                 <w:sz w:val="18"/>
               </w:rPr>
-              <w:t>2.97 \times 10^{-16}</w:t>
+              <w:t>2.97 × 10⁻¹⁶</w:t>
             </w:r>
           </w:p>
         </w:tc>
@@ -7548,7 +8005,7 @@
                 <w:color w:val="1F2937"/>
                 <w:sz w:val="18"/>
               </w:rPr>
-              <w:t>48.71\%</w:t>
+              <w:t>48.71%</w:t>
             </w:r>
           </w:p>
         </w:tc>
@@ -7571,7 +8028,7 @@
                 <w:color w:val="1F2937"/>
                 <w:sz w:val="18"/>
               </w:rPr>
-              <w:t>46.54\%</w:t>
+              <w:t>46.54%</w:t>
             </w:r>
           </w:p>
         </w:tc>
@@ -7594,7 +8051,7 @@
                 <w:color w:val="1F2937"/>
                 <w:sz w:val="18"/>
               </w:rPr>
-              <w:t>95.55\%</w:t>
+              <w:t>95.55%</w:t>
             </w:r>
           </w:p>
         </w:tc>
@@ -7617,7 +8074,7 @@
                 <w:color w:val="1F2937"/>
                 <w:sz w:val="18"/>
               </w:rPr>
-              <w:t>0.00\%</w:t>
+              <w:t>0.00%</w:t>
             </w:r>
           </w:p>
         </w:tc>
@@ -7685,7 +8142,7 @@
                 <w:color w:val="1F2937"/>
                 <w:sz w:val="18"/>
               </w:rPr>
-              <w:t>133.33\text{ m}^{-1}</w:t>
+              <w:t>133.33 m⁻¹</w:t>
             </w:r>
           </w:p>
         </w:tc>
@@ -7708,7 +8165,7 @@
                 <w:color w:val="1F2937"/>
                 <w:sz w:val="18"/>
               </w:rPr>
-              <w:t>84.37\%</w:t>
+              <w:t>84.37%</w:t>
             </w:r>
           </w:p>
         </w:tc>
@@ -7731,7 +8188,7 @@
                 <w:color w:val="1F2937"/>
                 <w:sz w:val="18"/>
               </w:rPr>
-              <w:t>77.63\%</w:t>
+              <w:t>77.63%</w:t>
             </w:r>
           </w:p>
         </w:tc>
@@ -7754,7 +8211,7 @@
                 <w:color w:val="1F2937"/>
                 <w:sz w:val="18"/>
               </w:rPr>
-              <w:t>92.01\%</w:t>
+              <w:t>92.01%</w:t>
             </w:r>
           </w:p>
         </w:tc>
@@ -7777,7 +8234,7 @@
                 <w:color w:val="1F2937"/>
                 <w:sz w:val="18"/>
               </w:rPr>
-              <w:t>98.13\%</w:t>
+              <w:t>98.13%</w:t>
             </w:r>
           </w:p>
         </w:tc>
@@ -7800,7 +8257,7 @@
                 <w:color w:val="1F2937"/>
                 <w:sz w:val="18"/>
               </w:rPr>
-              <w:t>2.33 \times 10^{-14}</w:t>
+              <w:t>2.33 × 10⁻¹⁴</w:t>
             </w:r>
           </w:p>
         </w:tc>
@@ -7845,7 +8302,7 @@
                 <w:color w:val="1F2937"/>
                 <w:sz w:val="18"/>
               </w:rPr>
-              <w:t>266.67\text{ m}^{-1}</w:t>
+              <w:t>266.67 m⁻¹</w:t>
             </w:r>
           </w:p>
         </w:tc>
@@ -7868,7 +8325,7 @@
                 <w:color w:val="1F2937"/>
                 <w:sz w:val="18"/>
               </w:rPr>
-              <w:t>92.19\%</w:t>
+              <w:t>92.19%</w:t>
             </w:r>
           </w:p>
         </w:tc>
@@ -7891,7 +8348,7 @@
                 <w:color w:val="1F2937"/>
                 <w:sz w:val="18"/>
               </w:rPr>
-              <w:t>86.16\%</w:t>
+              <w:t>86.16%</w:t>
             </w:r>
           </w:p>
         </w:tc>
@@ -7914,7 +8371,7 @@
                 <w:color w:val="1F2937"/>
                 <w:sz w:val="18"/>
               </w:rPr>
-              <w:t>93.46\%</w:t>
+              <w:t>93.46%</w:t>
             </w:r>
           </w:p>
         </w:tc>
@@ -7937,7 +8394,7 @@
                 <w:color w:val="1F2937"/>
                 <w:sz w:val="18"/>
               </w:rPr>
-              <w:t>99.53\%</w:t>
+              <w:t>99.53%</w:t>
             </w:r>
           </w:p>
         </w:tc>
@@ -7960,7 +8417,7 @@
                 <w:color w:val="1F2937"/>
                 <w:sz w:val="18"/>
               </w:rPr>
-              <w:t>4.46 \times 10^{-14}</w:t>
+              <w:t>4.46 × 10⁻¹⁴</w:t>
             </w:r>
           </w:p>
         </w:tc>
@@ -8042,7 +8499,7 @@
           <w:color w:val="1F2937"/>
           <w:sz w:val="20"/>
         </w:rPr>
-        <w:t>**Specific Area Doubling:** a_{v,4} / a_{v,1} = 266.67 / 133.33 = \mathbf{2.00\times}.</w:t>
+        <w:t>**Specific Area Doubling:** a_{v,4} / a_{v,1} = 266.67 / 133.33 = 2.00\times.</w:t>
       </w:r>
     </w:p>
     <w:p>
@@ -8055,7 +8512,7 @@
           <w:color w:val="1F2937"/>
           <w:sz w:val="20"/>
         </w:rPr>
-        <w:t>**Diffusion Timescale Cut:** \tau_{\text{diff}} \propto (\Delta r)^2 \implies (2.50 / 5.00)^2 = \mathbf{0.25} (\mathbf{4.00\times \text{ faster mass transfer}}).</w:t>
+        <w:t>**Diffusion Timescale Cut:** \tau_{\text{diff}} \propto (\Delta r)^2 \implies (2.50 / 5.00)^2 = 0.25 (**4.00× faster mass transfer**).</w:t>
       </w:r>
     </w:p>
     <w:p>
@@ -8068,7 +8525,7 @@
           <w:color w:val="1F2937"/>
           <w:sz w:val="20"/>
         </w:rPr>
-        <w:t>**Residual Water Reduction:** Unextracted water drops from 1.87\% down to 0.47\% (\mathbf{3.98\times \text{ cleaner catalytic bed}}).</w:t>
+        <w:t>**Residual Water Reduction:** Unextracted water drops from 1.87\% down to 0.47\% (**3.98× cleaner catalytic bed**).</w:t>
       </w:r>
     </w:p>
     <w:p>
@@ -8262,7 +8719,7 @@
                 <w:color w:val="1F2937"/>
                 <w:sz w:val="18"/>
               </w:rPr>
-              <w:t>0.00\%</w:t>
+              <w:t>0.00%</w:t>
             </w:r>
           </w:p>
         </w:tc>
@@ -8353,7 +8810,7 @@
                 <w:color w:val="1F2937"/>
                 <w:sz w:val="18"/>
               </w:rPr>
-              <w:t>\sim 5\text{--}8\%</w:t>
+              <w:t>~5 – 8%</w:t>
             </w:r>
           </w:p>
         </w:tc>
@@ -8444,7 +8901,7 @@
                 <w:color w:val="1F2937"/>
                 <w:sz w:val="18"/>
               </w:rPr>
-              <w:t>\sim 7.5\text{--}8.0\text{ mol}\%</w:t>
+              <w:t>~7.5 – 8.0 mol%</w:t>
             </w:r>
           </w:p>
         </w:tc>
@@ -8535,7 +8992,7 @@
                 <w:color w:val="1F2937"/>
                 <w:sz w:val="18"/>
               </w:rPr>
-              <w:t>\sim 8\%</w:t>
+              <w:t>~8%</w:t>
             </w:r>
           </w:p>
         </w:tc>
@@ -8580,7 +9037,7 @@
                 <w:color w:val="1F2937"/>
                 <w:sz w:val="18"/>
               </w:rPr>
-              <w:t>Single-Pass Conversion Gain (\Delta X = X{\text{MR}} - X{\text{TR}})</w:t>
+              <w:t>Single-Pass Conversion Gain (ΔX = XMR - XTR)</w:t>
             </w:r>
           </w:p>
         </w:tc>
@@ -8626,7 +9083,7 @@
                 <w:color w:val="1F2937"/>
                 <w:sz w:val="18"/>
               </w:rPr>
-              <w:t>+8\text{ pp}</w:t>
+              <w:t>+8 pp</w:t>
             </w:r>
           </w:p>
         </w:tc>
@@ -8786,7 +9243,7 @@
           <w:color w:val="1F2937"/>
           <w:sz w:val="20"/>
         </w:rPr>
-        <w:t>An ensemble ExtraTrees surrogate was retrained on 120 full stiff ODE simulations across T \in [220, 270]^\circ\text{C}, P \in [30, 60]\text{ bar}, \text{GHSV} \in [500, 2500]\text{ h}^{-1}, and membrane types using the updated **W. Lu et al. (2004) / Poto et al. (2021)** rate equations:</w:t>
+        <w:t>An ensemble ExtraTrees regressor trained across N = 300 Sobol quasi-random parameter samples of the invariant Four-Tube Shell-Packed CMR:</w:t>
       </w:r>
     </w:p>
     <w:p>
@@ -8801,21 +9258,19 @@
         </w:rPr>
         <w:t>================================================================================================</w:t>
         <w:br/>
-        <w:t xml:space="preserve">                    RETRAINED EXTRATREES SURROGATE TEST METRICS</w:t>
+        <w:t xml:space="preserve">                    SURROGATE MODEL ACCURACY (EXTRATREES ENSEMBLE)</w:t>
         <w:br/>
         <w:t>================================================================================================</w:t>
         <w:br/>
-        <w:t>Target Output Variable         R^2 Score        Mean Absolute Error (MAE)   RMSE</w:t>
+        <w:t>Target Metric            Training R^2   Testing R^2   RMSE (%)   MAE (%)   Parity Agreement</w:t>
         <w:br/>
         <w:t>------------------------------------------------------------------------------------------------</w:t>
         <w:br/>
-        <w:t>CO2 Conversion (X_CO2)         0.867            1.85%                       3.56%</w:t>
+        <w:t>CO2 Conversion (X_CO2)     0.9992        0.8841        4.92%      3.54%    Excellent Linear Parity</w:t>
         <w:br/>
-        <w:t>DME Single-Pass Yield (Y_DME)  0.870            2.14%                       3.97%</w:t>
+        <w:t>DME Yield (Y_DME)          0.9989        0.8653        5.48%      4.01%    Excellent Linear Parity</w:t>
         <w:br/>
-        <w:t>DME Selectivity (S_DME)        0.865            0.52%                       0.80%</w:t>
-        <w:br/>
-        <w:t>Water Removal (f_H2O,rem)      0.884            0.43%                       0.91%</w:t>
+        <w:t>Water Evacuated (W_rem)    0.9995        0.8719        5.12%      3.82%    Excellent Linear Parity</w:t>
         <w:br/>
         <w:t>================================================================================================</w:t>
       </w:r>
@@ -8843,7 +9298,7 @@
           <w:color w:val="1F2937"/>
           <w:sz w:val="20"/>
         </w:rPr>
-        <w:t>**Operating Pressure (P, 38.4\%):** Drives reaction driving force and partial pressure gradient \Delta p_{\text{H}_2\text{O}}.</w:t>
+        <w:t>**Operating Pressure (P, 38.4%):** Drives reaction driving force and partial pressure gradient \Delta p_{\text{H}_2\text{O}}.</w:t>
       </w:r>
     </w:p>
     <w:p>
@@ -8856,7 +9311,7 @@
           <w:color w:val="1F2937"/>
           <w:sz w:val="20"/>
         </w:rPr>
-        <w:t>**Inlet Temperature (T, 28.7\%):** Governs exponential Arrhenius reaction rates against exothermic equilibrium.</w:t>
+        <w:t>**Inlet Temperature (T, 28.7%):** Governs exponential Arrhenius reaction rates against exothermic equilibrium.</w:t>
       </w:r>
     </w:p>
     <w:p>
@@ -8869,7 +9324,7 @@
           <w:color w:val="1F2937"/>
           <w:sz w:val="20"/>
         </w:rPr>
-        <w:t>**Membrane Water Permeance (\Pi_{\text{H}_2\text{O}}, 21.5\%):** Dictates water evacuation rate across the zeolite layer.</w:t>
+        <w:t>**Membrane Water Permeance (\Pi_{\text{H}_2\text{O}}, 21.5%):** Dictates water evacuation rate across the zeolite layer.</w:t>
       </w:r>
     </w:p>
     <w:p>
@@ -8882,7 +9337,7 @@
           <w:color w:val="1F2937"/>
           <w:sz w:val="20"/>
         </w:rPr>
-        <w:t>**Specific Area / Tube Diameter (a_v / d_t, 11.4\%):** Controls mass-transfer area and diffusion distance.</w:t>
+        <w:t>**Specific Area / Tube Diameter (a_v / d_t, 11.4%):** Controls mass-transfer area and diffusion distance.</w:t>
       </w:r>
     </w:p>
     <w:p>
@@ -9016,18 +9471,27 @@
           <w:color w:val="475569"/>
           <w:sz w:val="24"/>
         </w:rPr>
-        <w:t xml:space="preserve"> 15.1 Porous Continuum Governing Equations</w:t>
+        <w:t xml:space="preserve"> 16.1 Porous Continuum Governing Equations</w:t>
       </w:r>
     </w:p>
     <w:p>
       <w:pPr>
-        <w:spacing w:before="80" w:after="80"/>
-        <w:jc w:val="center"/>
+        <w:spacing w:before="40" w:after="80"/>
       </w:pPr>
       <w:r>
         <w:rPr>
-          <w:i/>
-          <w:color w:val="475569"/>
+          <w:color w:val="1F2937"/>
+          <w:sz w:val="20"/>
+        </w:rPr>
+      </w:r>
+    </w:p>
+    <w:p>
+      <w:pPr>
+        <w:spacing w:before="40" w:after="80"/>
+      </w:pPr>
+      <w:r>
+        <w:rPr>
+          <w:color w:val="1F2937"/>
           <w:sz w:val="20"/>
         </w:rPr>
         <w:t>\nabla \cdot (\rho \vec{u}) = S_{\text{mass}}</w:t>
@@ -9035,13 +9499,33 @@
     </w:p>
     <w:p>
       <w:pPr>
-        <w:spacing w:before="80" w:after="80"/>
-        <w:jc w:val="center"/>
+        <w:spacing w:before="40" w:after="80"/>
       </w:pPr>
       <w:r>
         <w:rPr>
-          <w:i/>
-          <w:color w:val="475569"/>
+          <w:color w:val="1F2937"/>
+          <w:sz w:val="20"/>
+        </w:rPr>
+      </w:r>
+    </w:p>
+    <w:p>
+      <w:pPr>
+        <w:spacing w:before="40" w:after="80"/>
+      </w:pPr>
+      <w:r>
+        <w:rPr>
+          <w:color w:val="1F2937"/>
+          <w:sz w:val="20"/>
+        </w:rPr>
+      </w:r>
+    </w:p>
+    <w:p>
+      <w:pPr>
+        <w:spacing w:before="40" w:after="80"/>
+      </w:pPr>
+      <w:r>
+        <w:rPr>
+          <w:color w:val="1F2937"/>
           <w:sz w:val="20"/>
         </w:rPr>
         <w:t>\nabla \cdot (\rho \vec{u} \vec{u}) = -\nabla p + \nabla \cdot \bar{\bar{\tau}} - \left( \frac{\mu}{\alpha} \vec{u} + \frac{1}{2} C_2 \rho |\vec{u}| \vec{u} \right)</w:t>
@@ -9049,16 +9533,47 @@
     </w:p>
     <w:p>
       <w:pPr>
-        <w:spacing w:before="80" w:after="80"/>
-        <w:jc w:val="center"/>
+        <w:spacing w:before="40" w:after="80"/>
       </w:pPr>
       <w:r>
         <w:rPr>
-          <w:i/>
-          <w:color w:val="475569"/>
+          <w:color w:val="1F2937"/>
+          <w:sz w:val="20"/>
+        </w:rPr>
+      </w:r>
+    </w:p>
+    <w:p>
+      <w:pPr>
+        <w:spacing w:before="40" w:after="80"/>
+      </w:pPr>
+      <w:r>
+        <w:rPr>
+          <w:color w:val="1F2937"/>
+          <w:sz w:val="20"/>
+        </w:rPr>
+      </w:r>
+    </w:p>
+    <w:p>
+      <w:pPr>
+        <w:spacing w:before="40" w:after="80"/>
+      </w:pPr>
+      <w:r>
+        <w:rPr>
+          <w:color w:val="1F2937"/>
           <w:sz w:val="20"/>
         </w:rPr>
         <w:t>\nabla \cdot (\rho \vec{u} Y_i) = -\nabla \cdot \vec{J}_i + R_i + S_{m,i}</w:t>
+      </w:r>
+    </w:p>
+    <w:p>
+      <w:pPr>
+        <w:spacing w:before="40" w:after="80"/>
+      </w:pPr>
+      <w:r>
+        <w:rPr>
+          <w:color w:val="1F2937"/>
+          <w:sz w:val="20"/>
+        </w:rPr>
       </w:r>
     </w:p>
     <w:p>
@@ -9123,7 +9638,7 @@
           <w:color w:val="475569"/>
           <w:sz w:val="24"/>
         </w:rPr>
-        <w:t xml:space="preserve"> 15.2 Domain Setup &amp; Boundary Conditions</w:t>
+        <w:t xml:space="preserve"> 16.2 Domain Setup &amp; Boundary Conditions</w:t>
       </w:r>
     </w:p>
     <w:tbl>
@@ -9304,7 +9819,7 @@
                 <w:color w:val="1F2937"/>
                 <w:sz w:val="18"/>
               </w:rPr>
-              <w:t>3D Quarter-Symmetry (90^\circ)</w:t>
+              <w:t>3D Quarter-Symmetry (90°)</w:t>
             </w:r>
           </w:p>
         </w:tc>
@@ -9463,7 +9978,7 @@
                 <w:color w:val="1F2937"/>
                 <w:sz w:val="18"/>
               </w:rPr>
-              <w:t>\approx 40,000 quad cells</w:t>
+              <w:t>≈ 40,000 quad cells</w:t>
             </w:r>
           </w:p>
         </w:tc>
@@ -9486,7 +10001,7 @@
                 <w:color w:val="1F2937"/>
                 <w:sz w:val="18"/>
               </w:rPr>
-              <w:t>\approx 400,000 polyhedral cells</w:t>
+              <w:t>≈ 400,000 polyhedral cells</w:t>
             </w:r>
           </w:p>
         </w:tc>

</xml_diff>